<commit_message>
Add completed project documentation
</commit_message>
<xml_diff>
--- a/DF_TermProject_Spring2026.docx
+++ b/DF_TermProject_Spring2026.docx
@@ -428,7 +428,7 @@
     <w:p/>
     <w:tbl>
       <w:tblPr>
-        <w:tblW w:w="8900" w:type="dxa"/>
+        <w:tblW w:w="10078" w:type="dxa"/>
         <w:tblBorders>
           <w:top w:val="single" w:sz="4" w:space="0" w:color="auto"/>
           <w:left w:val="single" w:sz="4" w:space="0" w:color="auto"/>
@@ -444,19 +444,19 @@
         <w:tblLook w:val="04A0" w:firstRow="1" w:lastRow="0" w:firstColumn="1" w:lastColumn="0" w:noHBand="0" w:noVBand="1"/>
       </w:tblPr>
       <w:tblGrid>
-        <w:gridCol w:w="452"/>
-        <w:gridCol w:w="985"/>
-        <w:gridCol w:w="1208"/>
-        <w:gridCol w:w="1663"/>
-        <w:gridCol w:w="1141"/>
-        <w:gridCol w:w="1141"/>
-        <w:gridCol w:w="974"/>
-        <w:gridCol w:w="1441"/>
+        <w:gridCol w:w="394"/>
+        <w:gridCol w:w="835"/>
+        <w:gridCol w:w="1642"/>
+        <w:gridCol w:w="1273"/>
+        <w:gridCol w:w="1048"/>
+        <w:gridCol w:w="1128"/>
+        <w:gridCol w:w="2646"/>
+        <w:gridCol w:w="1112"/>
       </w:tblGrid>
       <w:tr>
         <w:tc>
           <w:tcPr>
-            <w:tcW w:w="500" w:type="dxa"/>
+            <w:tcW w:w="394" w:type="dxa"/>
             <w:tcBorders>
               <w:top w:val="single" w:sz="1" w:space="0" w:color="AAAAAA"/>
               <w:left w:val="single" w:sz="1" w:space="0" w:color="AAAAAA"/>
@@ -490,7 +490,7 @@
         </w:tc>
         <w:tc>
           <w:tcPr>
-            <w:tcW w:w="1400" w:type="dxa"/>
+            <w:tcW w:w="837" w:type="dxa"/>
             <w:tcBorders>
               <w:top w:val="single" w:sz="1" w:space="0" w:color="AAAAAA"/>
               <w:left w:val="single" w:sz="1" w:space="0" w:color="AAAAAA"/>
@@ -524,7 +524,7 @@
         </w:tc>
         <w:tc>
           <w:tcPr>
-            <w:tcW w:w="1400" w:type="dxa"/>
+            <w:tcW w:w="1620" w:type="dxa"/>
             <w:tcBorders>
               <w:top w:val="single" w:sz="1" w:space="0" w:color="AAAAAA"/>
               <w:left w:val="single" w:sz="1" w:space="0" w:color="AAAAAA"/>
@@ -558,7 +558,7 @@
         </w:tc>
         <w:tc>
           <w:tcPr>
-            <w:tcW w:w="1100" w:type="dxa"/>
+            <w:tcW w:w="1276" w:type="dxa"/>
             <w:tcBorders>
               <w:top w:val="single" w:sz="1" w:space="0" w:color="AAAAAA"/>
               <w:left w:val="single" w:sz="1" w:space="0" w:color="AAAAAA"/>
@@ -592,7 +592,7 @@
         </w:tc>
         <w:tc>
           <w:tcPr>
-            <w:tcW w:w="1200" w:type="dxa"/>
+            <w:tcW w:w="1051" w:type="dxa"/>
             <w:tcBorders>
               <w:top w:val="single" w:sz="1" w:space="0" w:color="AAAAAA"/>
               <w:left w:val="single" w:sz="1" w:space="0" w:color="AAAAAA"/>
@@ -626,7 +626,7 @@
         </w:tc>
         <w:tc>
           <w:tcPr>
-            <w:tcW w:w="1200" w:type="dxa"/>
+            <w:tcW w:w="1131" w:type="dxa"/>
             <w:tcBorders>
               <w:top w:val="single" w:sz="1" w:space="0" w:color="AAAAAA"/>
               <w:left w:val="single" w:sz="1" w:space="0" w:color="AAAAAA"/>
@@ -660,7 +660,7 @@
         </w:tc>
         <w:tc>
           <w:tcPr>
-            <w:tcW w:w="1200" w:type="dxa"/>
+            <w:tcW w:w="2654" w:type="dxa"/>
             <w:tcBorders>
               <w:top w:val="single" w:sz="1" w:space="0" w:color="AAAAAA"/>
               <w:left w:val="single" w:sz="1" w:space="0" w:color="AAAAAA"/>
@@ -694,7 +694,7 @@
         </w:tc>
         <w:tc>
           <w:tcPr>
-            <w:tcW w:w="900" w:type="dxa"/>
+            <w:tcW w:w="1115" w:type="dxa"/>
             <w:tcBorders>
               <w:top w:val="single" w:sz="1" w:space="0" w:color="AAAAAA"/>
               <w:left w:val="single" w:sz="1" w:space="0" w:color="AAAAAA"/>
@@ -730,7 +730,7 @@
       <w:tr>
         <w:tc>
           <w:tcPr>
-            <w:tcW w:w="500" w:type="dxa"/>
+            <w:tcW w:w="394" w:type="dxa"/>
             <w:tcBorders>
               <w:top w:val="single" w:sz="1" w:space="0" w:color="AAAAAA"/>
               <w:left w:val="single" w:sz="1" w:space="0" w:color="AAAAAA"/>
@@ -746,11 +746,137 @@
             </w:tcMar>
             <w:vAlign w:val="center"/>
           </w:tcPr>
+          <w:p>
+            <w:r>
+              <w:t>1</w:t>
+            </w:r>
+          </w:p>
+        </w:tc>
+        <w:tc>
+          <w:tcPr>
+            <w:tcW w:w="837" w:type="dxa"/>
+            <w:tcBorders>
+              <w:top w:val="single" w:sz="1" w:space="0" w:color="AAAAAA"/>
+              <w:left w:val="single" w:sz="1" w:space="0" w:color="AAAAAA"/>
+              <w:bottom w:val="single" w:sz="1" w:space="0" w:color="AAAAAA"/>
+              <w:right w:val="single" w:sz="1" w:space="0" w:color="AAAAAA"/>
+            </w:tcBorders>
+            <w:shd w:val="clear" w:color="auto" w:fill="FFFFFF"/>
+            <w:tcMar>
+              <w:top w:w="80" w:type="dxa"/>
+              <w:left w:w="120" w:type="dxa"/>
+              <w:bottom w:w="80" w:type="dxa"/>
+              <w:right w:w="120" w:type="dxa"/>
+            </w:tcMar>
+            <w:vAlign w:val="center"/>
+          </w:tcPr>
+          <w:p>
+            <w:r>
+              <w:t>Haroon Ashar</w:t>
+            </w:r>
+          </w:p>
+        </w:tc>
+        <w:tc>
+          <w:tcPr>
+            <w:tcW w:w="1620" w:type="dxa"/>
+            <w:tcBorders>
+              <w:top w:val="single" w:sz="1" w:space="0" w:color="AAAAAA"/>
+              <w:left w:val="single" w:sz="1" w:space="0" w:color="AAAAAA"/>
+              <w:bottom w:val="single" w:sz="1" w:space="0" w:color="AAAAAA"/>
+              <w:right w:val="single" w:sz="1" w:space="0" w:color="AAAAAA"/>
+            </w:tcBorders>
+            <w:shd w:val="clear" w:color="auto" w:fill="FFFFFF"/>
+            <w:tcMar>
+              <w:top w:w="80" w:type="dxa"/>
+              <w:left w:w="120" w:type="dxa"/>
+              <w:bottom w:w="80" w:type="dxa"/>
+              <w:right w:w="120" w:type="dxa"/>
+            </w:tcMar>
+            <w:vAlign w:val="center"/>
+          </w:tcPr>
+          <w:p>
+            <w:r>
+              <w:t>HaroonAshar</w:t>
+            </w:r>
+          </w:p>
+        </w:tc>
+        <w:tc>
+          <w:tcPr>
+            <w:tcW w:w="1276" w:type="dxa"/>
+            <w:tcBorders>
+              <w:top w:val="single" w:sz="1" w:space="0" w:color="AAAAAA"/>
+              <w:left w:val="single" w:sz="1" w:space="0" w:color="AAAAAA"/>
+              <w:bottom w:val="single" w:sz="1" w:space="0" w:color="AAAAAA"/>
+              <w:right w:val="single" w:sz="1" w:space="0" w:color="AAAAAA"/>
+            </w:tcBorders>
+            <w:shd w:val="clear" w:color="auto" w:fill="FFFFFF"/>
+            <w:tcMar>
+              <w:top w:w="80" w:type="dxa"/>
+              <w:left w:w="120" w:type="dxa"/>
+              <w:bottom w:w="80" w:type="dxa"/>
+              <w:right w:w="120" w:type="dxa"/>
+            </w:tcMar>
+            <w:vAlign w:val="center"/>
+          </w:tcPr>
+          <w:p>
+            <w:r>
+              <w:t>Lead</w:t>
+            </w:r>
+          </w:p>
+        </w:tc>
+        <w:tc>
+          <w:tcPr>
+            <w:tcW w:w="1051" w:type="dxa"/>
+            <w:tcBorders>
+              <w:top w:val="single" w:sz="1" w:space="0" w:color="AAAAAA"/>
+              <w:left w:val="single" w:sz="1" w:space="0" w:color="AAAAAA"/>
+              <w:bottom w:val="single" w:sz="1" w:space="0" w:color="AAAAAA"/>
+              <w:right w:val="single" w:sz="1" w:space="0" w:color="AAAAAA"/>
+            </w:tcBorders>
+            <w:shd w:val="clear" w:color="auto" w:fill="FFFFFF"/>
+            <w:tcMar>
+              <w:top w:w="80" w:type="dxa"/>
+              <w:left w:w="120" w:type="dxa"/>
+              <w:bottom w:w="80" w:type="dxa"/>
+              <w:right w:w="120" w:type="dxa"/>
+            </w:tcMar>
+            <w:vAlign w:val="center"/>
+          </w:tcPr>
+          <w:p>
+            <w:r>
+              <w:t>ci-dev.yml</w:t>
+            </w:r>
+            <w:r>
+              <w:t xml:space="preserve">, </w:t>
+            </w:r>
+            <w:r>
+              <w:t>cd-prod.yml</w:t>
+            </w:r>
+          </w:p>
+        </w:tc>
+        <w:tc>
+          <w:tcPr>
+            <w:tcW w:w="1131" w:type="dxa"/>
+            <w:tcBorders>
+              <w:top w:val="single" w:sz="1" w:space="0" w:color="AAAAAA"/>
+              <w:left w:val="single" w:sz="1" w:space="0" w:color="AAAAAA"/>
+              <w:bottom w:val="single" w:sz="1" w:space="0" w:color="AAAAAA"/>
+              <w:right w:val="single" w:sz="1" w:space="0" w:color="AAAAAA"/>
+            </w:tcBorders>
+            <w:shd w:val="clear" w:color="auto" w:fill="FFFFFF"/>
+            <w:tcMar>
+              <w:top w:w="80" w:type="dxa"/>
+              <w:left w:w="120" w:type="dxa"/>
+              <w:bottom w:w="80" w:type="dxa"/>
+              <w:right w:w="120" w:type="dxa"/>
+            </w:tcMar>
+            <w:vAlign w:val="center"/>
+          </w:tcPr>
           <w:p/>
         </w:tc>
         <w:tc>
           <w:tcPr>
-            <w:tcW w:w="1400" w:type="dxa"/>
+            <w:tcW w:w="2654" w:type="dxa"/>
             <w:tcBorders>
               <w:top w:val="single" w:sz="1" w:space="0" w:color="AAAAAA"/>
               <w:left w:val="single" w:sz="1" w:space="0" w:color="AAAAAA"/>
@@ -766,11 +892,18 @@
             </w:tcMar>
             <w:vAlign w:val="center"/>
           </w:tcPr>
-          <w:p/>
-        </w:tc>
-        <w:tc>
-          <w:tcPr>
-            <w:tcW w:w="1400" w:type="dxa"/>
+          <w:p>
+            <w:r>
+              <w:t>feature/haroonashar/home</w:t>
+            </w:r>
+            <w:r>
+              <w:t>, develop,staging,prod</w:t>
+            </w:r>
+          </w:p>
+        </w:tc>
+        <w:tc>
+          <w:tcPr>
+            <w:tcW w:w="1115" w:type="dxa"/>
             <w:tcBorders>
               <w:top w:val="single" w:sz="1" w:space="0" w:color="AAAAAA"/>
               <w:left w:val="single" w:sz="1" w:space="0" w:color="AAAAAA"/>
@@ -786,113 +919,17 @@
             </w:tcMar>
             <w:vAlign w:val="center"/>
           </w:tcPr>
-          <w:p/>
-        </w:tc>
-        <w:tc>
-          <w:tcPr>
-            <w:tcW w:w="1100" w:type="dxa"/>
-            <w:tcBorders>
-              <w:top w:val="single" w:sz="1" w:space="0" w:color="AAAAAA"/>
-              <w:left w:val="single" w:sz="1" w:space="0" w:color="AAAAAA"/>
-              <w:bottom w:val="single" w:sz="1" w:space="0" w:color="AAAAAA"/>
-              <w:right w:val="single" w:sz="1" w:space="0" w:color="AAAAAA"/>
-            </w:tcBorders>
-            <w:shd w:val="clear" w:color="auto" w:fill="FFFFFF"/>
-            <w:tcMar>
-              <w:top w:w="80" w:type="dxa"/>
-              <w:left w:w="120" w:type="dxa"/>
-              <w:bottom w:w="80" w:type="dxa"/>
-              <w:right w:w="120" w:type="dxa"/>
-            </w:tcMar>
-            <w:vAlign w:val="center"/>
-          </w:tcPr>
-          <w:p/>
-        </w:tc>
-        <w:tc>
-          <w:tcPr>
-            <w:tcW w:w="1200" w:type="dxa"/>
-            <w:tcBorders>
-              <w:top w:val="single" w:sz="1" w:space="0" w:color="AAAAAA"/>
-              <w:left w:val="single" w:sz="1" w:space="0" w:color="AAAAAA"/>
-              <w:bottom w:val="single" w:sz="1" w:space="0" w:color="AAAAAA"/>
-              <w:right w:val="single" w:sz="1" w:space="0" w:color="AAAAAA"/>
-            </w:tcBorders>
-            <w:shd w:val="clear" w:color="auto" w:fill="FFFFFF"/>
-            <w:tcMar>
-              <w:top w:w="80" w:type="dxa"/>
-              <w:left w:w="120" w:type="dxa"/>
-              <w:bottom w:w="80" w:type="dxa"/>
-              <w:right w:w="120" w:type="dxa"/>
-            </w:tcMar>
-            <w:vAlign w:val="center"/>
-          </w:tcPr>
-          <w:p/>
-        </w:tc>
-        <w:tc>
-          <w:tcPr>
-            <w:tcW w:w="1200" w:type="dxa"/>
-            <w:tcBorders>
-              <w:top w:val="single" w:sz="1" w:space="0" w:color="AAAAAA"/>
-              <w:left w:val="single" w:sz="1" w:space="0" w:color="AAAAAA"/>
-              <w:bottom w:val="single" w:sz="1" w:space="0" w:color="AAAAAA"/>
-              <w:right w:val="single" w:sz="1" w:space="0" w:color="AAAAAA"/>
-            </w:tcBorders>
-            <w:shd w:val="clear" w:color="auto" w:fill="FFFFFF"/>
-            <w:tcMar>
-              <w:top w:w="80" w:type="dxa"/>
-              <w:left w:w="120" w:type="dxa"/>
-              <w:bottom w:w="80" w:type="dxa"/>
-              <w:right w:w="120" w:type="dxa"/>
-            </w:tcMar>
-            <w:vAlign w:val="center"/>
-          </w:tcPr>
-          <w:p/>
-        </w:tc>
-        <w:tc>
-          <w:tcPr>
-            <w:tcW w:w="1200" w:type="dxa"/>
-            <w:tcBorders>
-              <w:top w:val="single" w:sz="1" w:space="0" w:color="AAAAAA"/>
-              <w:left w:val="single" w:sz="1" w:space="0" w:color="AAAAAA"/>
-              <w:bottom w:val="single" w:sz="1" w:space="0" w:color="AAAAAA"/>
-              <w:right w:val="single" w:sz="1" w:space="0" w:color="AAAAAA"/>
-            </w:tcBorders>
-            <w:shd w:val="clear" w:color="auto" w:fill="FFFFFF"/>
-            <w:tcMar>
-              <w:top w:w="80" w:type="dxa"/>
-              <w:left w:w="120" w:type="dxa"/>
-              <w:bottom w:w="80" w:type="dxa"/>
-              <w:right w:w="120" w:type="dxa"/>
-            </w:tcMar>
-            <w:vAlign w:val="center"/>
-          </w:tcPr>
-          <w:p/>
-        </w:tc>
-        <w:tc>
-          <w:tcPr>
-            <w:tcW w:w="900" w:type="dxa"/>
-            <w:tcBorders>
-              <w:top w:val="single" w:sz="1" w:space="0" w:color="AAAAAA"/>
-              <w:left w:val="single" w:sz="1" w:space="0" w:color="AAAAAA"/>
-              <w:bottom w:val="single" w:sz="1" w:space="0" w:color="AAAAAA"/>
-              <w:right w:val="single" w:sz="1" w:space="0" w:color="AAAAAA"/>
-            </w:tcBorders>
-            <w:shd w:val="clear" w:color="auto" w:fill="FFFFFF"/>
-            <w:tcMar>
-              <w:top w:w="80" w:type="dxa"/>
-              <w:left w:w="120" w:type="dxa"/>
-              <w:bottom w:w="80" w:type="dxa"/>
-              <w:right w:w="120" w:type="dxa"/>
-            </w:tcMar>
-            <w:vAlign w:val="center"/>
-          </w:tcPr>
-          <w:p/>
+          <w:p>
+            <w:r>
+              <w:t>Yes</w:t>
+            </w:r>
+          </w:p>
         </w:tc>
       </w:tr>
       <w:tr>
         <w:tc>
           <w:tcPr>
-            <w:tcW w:w="500" w:type="dxa"/>
+            <w:tcW w:w="394" w:type="dxa"/>
             <w:tcBorders>
               <w:top w:val="single" w:sz="1" w:space="0" w:color="AAAAAA"/>
               <w:left w:val="single" w:sz="1" w:space="0" w:color="AAAAAA"/>
@@ -908,11 +945,15 @@
             </w:tcMar>
             <w:vAlign w:val="center"/>
           </w:tcPr>
-          <w:p/>
-        </w:tc>
-        <w:tc>
-          <w:tcPr>
-            <w:tcW w:w="1400" w:type="dxa"/>
+          <w:p>
+            <w:r>
+              <w:t>2</w:t>
+            </w:r>
+          </w:p>
+        </w:tc>
+        <w:tc>
+          <w:tcPr>
+            <w:tcW w:w="837" w:type="dxa"/>
             <w:tcBorders>
               <w:top w:val="single" w:sz="1" w:space="0" w:color="AAAAAA"/>
               <w:left w:val="single" w:sz="1" w:space="0" w:color="AAAAAA"/>
@@ -928,11 +969,15 @@
             </w:tcMar>
             <w:vAlign w:val="center"/>
           </w:tcPr>
-          <w:p/>
-        </w:tc>
-        <w:tc>
-          <w:tcPr>
-            <w:tcW w:w="1400" w:type="dxa"/>
+          <w:p>
+            <w:r>
+              <w:t>Mateen</w:t>
+            </w:r>
+          </w:p>
+        </w:tc>
+        <w:tc>
+          <w:tcPr>
+            <w:tcW w:w="1620" w:type="dxa"/>
             <w:tcBorders>
               <w:top w:val="single" w:sz="1" w:space="0" w:color="AAAAAA"/>
               <w:left w:val="single" w:sz="1" w:space="0" w:color="AAAAAA"/>
@@ -948,11 +993,15 @@
             </w:tcMar>
             <w:vAlign w:val="center"/>
           </w:tcPr>
-          <w:p/>
-        </w:tc>
-        <w:tc>
-          <w:tcPr>
-            <w:tcW w:w="1100" w:type="dxa"/>
+          <w:p>
+            <w:r>
+              <w:t>abdulmateen-67</w:t>
+            </w:r>
+          </w:p>
+        </w:tc>
+        <w:tc>
+          <w:tcPr>
+            <w:tcW w:w="1276" w:type="dxa"/>
             <w:tcBorders>
               <w:top w:val="single" w:sz="1" w:space="0" w:color="AAAAAA"/>
               <w:left w:val="single" w:sz="1" w:space="0" w:color="AAAAAA"/>
@@ -968,11 +1017,15 @@
             </w:tcMar>
             <w:vAlign w:val="center"/>
           </w:tcPr>
-          <w:p/>
-        </w:tc>
-        <w:tc>
-          <w:tcPr>
-            <w:tcW w:w="1200" w:type="dxa"/>
+          <w:p>
+            <w:r>
+              <w:t>Member</w:t>
+            </w:r>
+          </w:p>
+        </w:tc>
+        <w:tc>
+          <w:tcPr>
+            <w:tcW w:w="1051" w:type="dxa"/>
             <w:tcBorders>
               <w:top w:val="single" w:sz="1" w:space="0" w:color="AAAAAA"/>
               <w:left w:val="single" w:sz="1" w:space="0" w:color="AAAAAA"/>
@@ -988,11 +1041,15 @@
             </w:tcMar>
             <w:vAlign w:val="center"/>
           </w:tcPr>
-          <w:p/>
-        </w:tc>
-        <w:tc>
-          <w:tcPr>
-            <w:tcW w:w="1200" w:type="dxa"/>
+          <w:p>
+            <w:r>
+              <w:t>cd-dev.yml</w:t>
+            </w:r>
+          </w:p>
+        </w:tc>
+        <w:tc>
+          <w:tcPr>
+            <w:tcW w:w="1131" w:type="dxa"/>
             <w:tcBorders>
               <w:top w:val="single" w:sz="1" w:space="0" w:color="AAAAAA"/>
               <w:left w:val="single" w:sz="1" w:space="0" w:color="AAAAAA"/>
@@ -1008,11 +1065,15 @@
             </w:tcMar>
             <w:vAlign w:val="center"/>
           </w:tcPr>
-          <w:p/>
-        </w:tc>
-        <w:tc>
-          <w:tcPr>
-            <w:tcW w:w="1200" w:type="dxa"/>
+          <w:p>
+            <w:r>
+              <w:t>Sawat.html</w:t>
+            </w:r>
+          </w:p>
+        </w:tc>
+        <w:tc>
+          <w:tcPr>
+            <w:tcW w:w="2654" w:type="dxa"/>
             <w:tcBorders>
               <w:top w:val="single" w:sz="1" w:space="0" w:color="AAAAAA"/>
               <w:left w:val="single" w:sz="1" w:space="0" w:color="AAAAAA"/>
@@ -1028,11 +1089,15 @@
             </w:tcMar>
             <w:vAlign w:val="center"/>
           </w:tcPr>
-          <w:p/>
-        </w:tc>
-        <w:tc>
-          <w:tcPr>
-            <w:tcW w:w="900" w:type="dxa"/>
+          <w:p>
+            <w:r>
+              <w:t>feature/abdulmateen-67/swat</w:t>
+            </w:r>
+          </w:p>
+        </w:tc>
+        <w:tc>
+          <w:tcPr>
+            <w:tcW w:w="1115" w:type="dxa"/>
             <w:tcBorders>
               <w:top w:val="single" w:sz="1" w:space="0" w:color="AAAAAA"/>
               <w:left w:val="single" w:sz="1" w:space="0" w:color="AAAAAA"/>
@@ -1048,13 +1113,17 @@
             </w:tcMar>
             <w:vAlign w:val="center"/>
           </w:tcPr>
-          <w:p/>
+          <w:p>
+            <w:r>
+              <w:t>yes</w:t>
+            </w:r>
+          </w:p>
         </w:tc>
       </w:tr>
       <w:tr>
         <w:tc>
           <w:tcPr>
-            <w:tcW w:w="500" w:type="dxa"/>
+            <w:tcW w:w="394" w:type="dxa"/>
             <w:tcBorders>
               <w:top w:val="single" w:sz="1" w:space="0" w:color="AAAAAA"/>
               <w:left w:val="single" w:sz="1" w:space="0" w:color="AAAAAA"/>
@@ -1070,11 +1139,15 @@
             </w:tcMar>
             <w:vAlign w:val="center"/>
           </w:tcPr>
-          <w:p/>
-        </w:tc>
-        <w:tc>
-          <w:tcPr>
-            <w:tcW w:w="1400" w:type="dxa"/>
+          <w:p>
+            <w:r>
+              <w:t>3</w:t>
+            </w:r>
+          </w:p>
+        </w:tc>
+        <w:tc>
+          <w:tcPr>
+            <w:tcW w:w="837" w:type="dxa"/>
             <w:tcBorders>
               <w:top w:val="single" w:sz="1" w:space="0" w:color="AAAAAA"/>
               <w:left w:val="single" w:sz="1" w:space="0" w:color="AAAAAA"/>
@@ -1090,11 +1163,15 @@
             </w:tcMar>
             <w:vAlign w:val="center"/>
           </w:tcPr>
-          <w:p/>
-        </w:tc>
-        <w:tc>
-          <w:tcPr>
-            <w:tcW w:w="1400" w:type="dxa"/>
+          <w:p>
+            <w:r>
+              <w:t>Hasham</w:t>
+            </w:r>
+          </w:p>
+        </w:tc>
+        <w:tc>
+          <w:tcPr>
+            <w:tcW w:w="1620" w:type="dxa"/>
             <w:tcBorders>
               <w:top w:val="single" w:sz="1" w:space="0" w:color="AAAAAA"/>
               <w:left w:val="single" w:sz="1" w:space="0" w:color="AAAAAA"/>
@@ -1110,11 +1187,15 @@
             </w:tcMar>
             <w:vAlign w:val="center"/>
           </w:tcPr>
-          <w:p/>
-        </w:tc>
-        <w:tc>
-          <w:tcPr>
-            <w:tcW w:w="1100" w:type="dxa"/>
+          <w:p>
+            <w:r>
+              <w:t>HASHAAMDOGAR</w:t>
+            </w:r>
+          </w:p>
+        </w:tc>
+        <w:tc>
+          <w:tcPr>
+            <w:tcW w:w="1276" w:type="dxa"/>
             <w:tcBorders>
               <w:top w:val="single" w:sz="1" w:space="0" w:color="AAAAAA"/>
               <w:left w:val="single" w:sz="1" w:space="0" w:color="AAAAAA"/>
@@ -1130,11 +1211,15 @@
             </w:tcMar>
             <w:vAlign w:val="center"/>
           </w:tcPr>
-          <w:p/>
-        </w:tc>
-        <w:tc>
-          <w:tcPr>
-            <w:tcW w:w="1200" w:type="dxa"/>
+          <w:p>
+            <w:r>
+              <w:t>Member</w:t>
+            </w:r>
+          </w:p>
+        </w:tc>
+        <w:tc>
+          <w:tcPr>
+            <w:tcW w:w="1051" w:type="dxa"/>
             <w:tcBorders>
               <w:top w:val="single" w:sz="1" w:space="0" w:color="AAAAAA"/>
               <w:left w:val="single" w:sz="1" w:space="0" w:color="AAAAAA"/>
@@ -1150,11 +1235,15 @@
             </w:tcMar>
             <w:vAlign w:val="center"/>
           </w:tcPr>
-          <w:p/>
-        </w:tc>
-        <w:tc>
-          <w:tcPr>
-            <w:tcW w:w="1200" w:type="dxa"/>
+          <w:p>
+            <w:r>
+              <w:t>ci-staging.yml</w:t>
+            </w:r>
+          </w:p>
+        </w:tc>
+        <w:tc>
+          <w:tcPr>
+            <w:tcW w:w="1131" w:type="dxa"/>
             <w:tcBorders>
               <w:top w:val="single" w:sz="1" w:space="0" w:color="AAAAAA"/>
               <w:left w:val="single" w:sz="1" w:space="0" w:color="AAAAAA"/>
@@ -1170,11 +1259,15 @@
             </w:tcMar>
             <w:vAlign w:val="center"/>
           </w:tcPr>
-          <w:p/>
-        </w:tc>
-        <w:tc>
-          <w:tcPr>
-            <w:tcW w:w="1200" w:type="dxa"/>
+          <w:p>
+            <w:r>
+              <w:t>Lahore.html</w:t>
+            </w:r>
+          </w:p>
+        </w:tc>
+        <w:tc>
+          <w:tcPr>
+            <w:tcW w:w="2654" w:type="dxa"/>
             <w:tcBorders>
               <w:top w:val="single" w:sz="1" w:space="0" w:color="AAAAAA"/>
               <w:left w:val="single" w:sz="1" w:space="0" w:color="AAAAAA"/>
@@ -1190,11 +1283,15 @@
             </w:tcMar>
             <w:vAlign w:val="center"/>
           </w:tcPr>
-          <w:p/>
-        </w:tc>
-        <w:tc>
-          <w:tcPr>
-            <w:tcW w:w="900" w:type="dxa"/>
+          <w:p>
+            <w:r>
+              <w:t>feature/HASHAAMDOGAR/lahore</w:t>
+            </w:r>
+          </w:p>
+        </w:tc>
+        <w:tc>
+          <w:tcPr>
+            <w:tcW w:w="1115" w:type="dxa"/>
             <w:tcBorders>
               <w:top w:val="single" w:sz="1" w:space="0" w:color="AAAAAA"/>
               <w:left w:val="single" w:sz="1" w:space="0" w:color="AAAAAA"/>
@@ -1210,13 +1307,17 @@
             </w:tcMar>
             <w:vAlign w:val="center"/>
           </w:tcPr>
-          <w:p/>
+          <w:p>
+            <w:r>
+              <w:t>yes</w:t>
+            </w:r>
+          </w:p>
         </w:tc>
       </w:tr>
       <w:tr>
         <w:tc>
           <w:tcPr>
-            <w:tcW w:w="500" w:type="dxa"/>
+            <w:tcW w:w="394" w:type="dxa"/>
             <w:tcBorders>
               <w:top w:val="single" w:sz="1" w:space="0" w:color="AAAAAA"/>
               <w:left w:val="single" w:sz="1" w:space="0" w:color="AAAAAA"/>
@@ -1232,11 +1333,15 @@
             </w:tcMar>
             <w:vAlign w:val="center"/>
           </w:tcPr>
-          <w:p/>
-        </w:tc>
-        <w:tc>
-          <w:tcPr>
-            <w:tcW w:w="1400" w:type="dxa"/>
+          <w:p>
+            <w:r>
+              <w:t>4</w:t>
+            </w:r>
+          </w:p>
+        </w:tc>
+        <w:tc>
+          <w:tcPr>
+            <w:tcW w:w="837" w:type="dxa"/>
             <w:tcBorders>
               <w:top w:val="single" w:sz="1" w:space="0" w:color="AAAAAA"/>
               <w:left w:val="single" w:sz="1" w:space="0" w:color="AAAAAA"/>
@@ -1252,11 +1357,15 @@
             </w:tcMar>
             <w:vAlign w:val="center"/>
           </w:tcPr>
-          <w:p/>
-        </w:tc>
-        <w:tc>
-          <w:tcPr>
-            <w:tcW w:w="1400" w:type="dxa"/>
+          <w:p>
+            <w:r>
+              <w:t>Asfand</w:t>
+            </w:r>
+          </w:p>
+        </w:tc>
+        <w:tc>
+          <w:tcPr>
+            <w:tcW w:w="1620" w:type="dxa"/>
             <w:tcBorders>
               <w:top w:val="single" w:sz="1" w:space="0" w:color="AAAAAA"/>
               <w:left w:val="single" w:sz="1" w:space="0" w:color="AAAAAA"/>
@@ -1272,11 +1381,15 @@
             </w:tcMar>
             <w:vAlign w:val="center"/>
           </w:tcPr>
-          <w:p/>
-        </w:tc>
-        <w:tc>
-          <w:tcPr>
-            <w:tcW w:w="1100" w:type="dxa"/>
+          <w:p>
+            <w:r>
+              <w:t>m-a-y-h</w:t>
+            </w:r>
+          </w:p>
+        </w:tc>
+        <w:tc>
+          <w:tcPr>
+            <w:tcW w:w="1276" w:type="dxa"/>
             <w:tcBorders>
               <w:top w:val="single" w:sz="1" w:space="0" w:color="AAAAAA"/>
               <w:left w:val="single" w:sz="1" w:space="0" w:color="AAAAAA"/>
@@ -1292,11 +1405,15 @@
             </w:tcMar>
             <w:vAlign w:val="center"/>
           </w:tcPr>
-          <w:p/>
-        </w:tc>
-        <w:tc>
-          <w:tcPr>
-            <w:tcW w:w="1200" w:type="dxa"/>
+          <w:p>
+            <w:r>
+              <w:t>Member</w:t>
+            </w:r>
+          </w:p>
+        </w:tc>
+        <w:tc>
+          <w:tcPr>
+            <w:tcW w:w="1051" w:type="dxa"/>
             <w:tcBorders>
               <w:top w:val="single" w:sz="1" w:space="0" w:color="AAAAAA"/>
               <w:left w:val="single" w:sz="1" w:space="0" w:color="AAAAAA"/>
@@ -1312,11 +1429,15 @@
             </w:tcMar>
             <w:vAlign w:val="center"/>
           </w:tcPr>
-          <w:p/>
-        </w:tc>
-        <w:tc>
-          <w:tcPr>
-            <w:tcW w:w="1200" w:type="dxa"/>
+          <w:p>
+            <w:r>
+              <w:t>cd-staging.yml</w:t>
+            </w:r>
+          </w:p>
+        </w:tc>
+        <w:tc>
+          <w:tcPr>
+            <w:tcW w:w="1131" w:type="dxa"/>
             <w:tcBorders>
               <w:top w:val="single" w:sz="1" w:space="0" w:color="AAAAAA"/>
               <w:left w:val="single" w:sz="1" w:space="0" w:color="AAAAAA"/>
@@ -1332,11 +1453,15 @@
             </w:tcMar>
             <w:vAlign w:val="center"/>
           </w:tcPr>
-          <w:p/>
-        </w:tc>
-        <w:tc>
-          <w:tcPr>
-            <w:tcW w:w="1200" w:type="dxa"/>
+          <w:p>
+            <w:r>
+              <w:t>Karachi.html</w:t>
+            </w:r>
+          </w:p>
+        </w:tc>
+        <w:tc>
+          <w:tcPr>
+            <w:tcW w:w="2654" w:type="dxa"/>
             <w:tcBorders>
               <w:top w:val="single" w:sz="1" w:space="0" w:color="AAAAAA"/>
               <w:left w:val="single" w:sz="1" w:space="0" w:color="AAAAAA"/>
@@ -1352,11 +1477,15 @@
             </w:tcMar>
             <w:vAlign w:val="center"/>
           </w:tcPr>
-          <w:p/>
-        </w:tc>
-        <w:tc>
-          <w:tcPr>
-            <w:tcW w:w="900" w:type="dxa"/>
+          <w:p>
+            <w:r>
+              <w:t>feature/m-a-y-h/karachi</w:t>
+            </w:r>
+          </w:p>
+        </w:tc>
+        <w:tc>
+          <w:tcPr>
+            <w:tcW w:w="1115" w:type="dxa"/>
             <w:tcBorders>
               <w:top w:val="single" w:sz="1" w:space="0" w:color="AAAAAA"/>
               <w:left w:val="single" w:sz="1" w:space="0" w:color="AAAAAA"/>
@@ -1372,13 +1501,17 @@
             </w:tcMar>
             <w:vAlign w:val="center"/>
           </w:tcPr>
-          <w:p/>
+          <w:p>
+            <w:r>
+              <w:t>yes</w:t>
+            </w:r>
+          </w:p>
         </w:tc>
       </w:tr>
       <w:tr>
         <w:tc>
           <w:tcPr>
-            <w:tcW w:w="500" w:type="dxa"/>
+            <w:tcW w:w="394" w:type="dxa"/>
             <w:tcBorders>
               <w:top w:val="single" w:sz="1" w:space="0" w:color="AAAAAA"/>
               <w:left w:val="single" w:sz="1" w:space="0" w:color="AAAAAA"/>
@@ -1394,11 +1527,15 @@
             </w:tcMar>
             <w:vAlign w:val="center"/>
           </w:tcPr>
-          <w:p/>
-        </w:tc>
-        <w:tc>
-          <w:tcPr>
-            <w:tcW w:w="1400" w:type="dxa"/>
+          <w:p>
+            <w:r>
+              <w:t>5</w:t>
+            </w:r>
+          </w:p>
+        </w:tc>
+        <w:tc>
+          <w:tcPr>
+            <w:tcW w:w="837" w:type="dxa"/>
             <w:tcBorders>
               <w:top w:val="single" w:sz="1" w:space="0" w:color="AAAAAA"/>
               <w:left w:val="single" w:sz="1" w:space="0" w:color="AAAAAA"/>
@@ -1414,11 +1551,15 @@
             </w:tcMar>
             <w:vAlign w:val="center"/>
           </w:tcPr>
-          <w:p/>
-        </w:tc>
-        <w:tc>
-          <w:tcPr>
-            <w:tcW w:w="1400" w:type="dxa"/>
+          <w:p>
+            <w:r>
+              <w:t>Ahmad</w:t>
+            </w:r>
+          </w:p>
+        </w:tc>
+        <w:tc>
+          <w:tcPr>
+            <w:tcW w:w="1620" w:type="dxa"/>
             <w:tcBorders>
               <w:top w:val="single" w:sz="1" w:space="0" w:color="AAAAAA"/>
               <w:left w:val="single" w:sz="1" w:space="0" w:color="AAAAAA"/>
@@ -1434,11 +1575,15 @@
             </w:tcMar>
             <w:vAlign w:val="center"/>
           </w:tcPr>
-          <w:p/>
-        </w:tc>
-        <w:tc>
-          <w:tcPr>
-            <w:tcW w:w="1100" w:type="dxa"/>
+          <w:p>
+            <w:r>
+              <w:t>MuhammadAhmad-n17</w:t>
+            </w:r>
+          </w:p>
+        </w:tc>
+        <w:tc>
+          <w:tcPr>
+            <w:tcW w:w="1276" w:type="dxa"/>
             <w:tcBorders>
               <w:top w:val="single" w:sz="1" w:space="0" w:color="AAAAAA"/>
               <w:left w:val="single" w:sz="1" w:space="0" w:color="AAAAAA"/>
@@ -1454,11 +1599,15 @@
             </w:tcMar>
             <w:vAlign w:val="center"/>
           </w:tcPr>
-          <w:p/>
-        </w:tc>
-        <w:tc>
-          <w:tcPr>
-            <w:tcW w:w="1200" w:type="dxa"/>
+          <w:p>
+            <w:r>
+              <w:t>Member</w:t>
+            </w:r>
+          </w:p>
+        </w:tc>
+        <w:tc>
+          <w:tcPr>
+            <w:tcW w:w="1051" w:type="dxa"/>
             <w:tcBorders>
               <w:top w:val="single" w:sz="1" w:space="0" w:color="AAAAAA"/>
               <w:left w:val="single" w:sz="1" w:space="0" w:color="AAAAAA"/>
@@ -1474,11 +1623,15 @@
             </w:tcMar>
             <w:vAlign w:val="center"/>
           </w:tcPr>
-          <w:p/>
-        </w:tc>
-        <w:tc>
-          <w:tcPr>
-            <w:tcW w:w="1200" w:type="dxa"/>
+          <w:p>
+            <w:r>
+              <w:t>ci-prod.yml</w:t>
+            </w:r>
+          </w:p>
+        </w:tc>
+        <w:tc>
+          <w:tcPr>
+            <w:tcW w:w="1131" w:type="dxa"/>
             <w:tcBorders>
               <w:top w:val="single" w:sz="1" w:space="0" w:color="AAAAAA"/>
               <w:left w:val="single" w:sz="1" w:space="0" w:color="AAAAAA"/>
@@ -1494,11 +1647,15 @@
             </w:tcMar>
             <w:vAlign w:val="center"/>
           </w:tcPr>
-          <w:p/>
-        </w:tc>
-        <w:tc>
-          <w:tcPr>
-            <w:tcW w:w="1200" w:type="dxa"/>
+          <w:p>
+            <w:r>
+              <w:t>Hunza.html</w:t>
+            </w:r>
+          </w:p>
+        </w:tc>
+        <w:tc>
+          <w:tcPr>
+            <w:tcW w:w="2654" w:type="dxa"/>
             <w:tcBorders>
               <w:top w:val="single" w:sz="1" w:space="0" w:color="AAAAAA"/>
               <w:left w:val="single" w:sz="1" w:space="0" w:color="AAAAAA"/>
@@ -1514,11 +1671,15 @@
             </w:tcMar>
             <w:vAlign w:val="center"/>
           </w:tcPr>
-          <w:p/>
-        </w:tc>
-        <w:tc>
-          <w:tcPr>
-            <w:tcW w:w="900" w:type="dxa"/>
+          <w:p>
+            <w:r>
+              <w:t>feature/MuhammadAhmad/hunza</w:t>
+            </w:r>
+          </w:p>
+        </w:tc>
+        <w:tc>
+          <w:tcPr>
+            <w:tcW w:w="1115" w:type="dxa"/>
             <w:tcBorders>
               <w:top w:val="single" w:sz="1" w:space="0" w:color="AAAAAA"/>
               <w:left w:val="single" w:sz="1" w:space="0" w:color="AAAAAA"/>
@@ -1534,7 +1695,11 @@
             </w:tcMar>
             <w:vAlign w:val="center"/>
           </w:tcPr>
-          <w:p/>
+          <w:p>
+            <w:r>
+              <w:t>yes</w:t>
+            </w:r>
+          </w:p>
         </w:tc>
       </w:tr>
     </w:tbl>
@@ -1549,51 +1714,26 @@
           <w:bCs/>
           <w:color w:val="1F3864"/>
         </w:rPr>
-        <w:t xml:space="preserve">Group Repository URL: </w:t>
-      </w:r>
-      <w:r>
-        <w:rPr>
-          <w:i/>
-          <w:iCs/>
-          <w:color w:val="595959"/>
-        </w:rPr>
-        <w:t>[Paste Your GitHub Repository URL Here]</w:t>
-      </w:r>
-    </w:p>
-    <w:p/>
-    <w:p>
-      <w:pPr>
-        <w:spacing w:before="60" w:after="60" w:line="276" w:lineRule="auto"/>
-      </w:pPr>
+        <w:t>Group Repository URL</w:t>
+      </w:r>
       <w:r>
         <w:rPr>
           <w:b/>
           <w:bCs/>
           <w:color w:val="1F3864"/>
         </w:rPr>
-        <w:t>Deployed Application URLs:</w:t>
-      </w:r>
-    </w:p>
-    <w:p>
-      <w:pPr>
-        <w:spacing w:before="60" w:after="60" w:line="276" w:lineRule="auto"/>
-      </w:pPr>
+        <w:t xml:space="preserve">: </w:t>
+      </w:r>
       <w:r>
         <w:rPr>
           <w:b/>
           <w:bCs/>
-        </w:rPr>
-        <w:t xml:space="preserve">  Development: </w:t>
-      </w:r>
-      <w:r>
-        <w:rPr>
-          <w:i/>
-          <w:iCs/>
-          <w:color w:val="595959"/>
-        </w:rPr>
-        <w:t>[Paste Render Development Service URL Here]</w:t>
-      </w:r>
-    </w:p>
+          <w:color w:val="1F3864"/>
+        </w:rPr>
+        <w:t>https://github.com/HaroonAshar/pakvista-cicd</w:t>
+      </w:r>
+    </w:p>
+    <w:p/>
     <w:p>
       <w:pPr>
         <w:spacing w:before="60" w:after="60" w:line="276" w:lineRule="auto"/>
@@ -1602,16 +1742,9 @@
         <w:rPr>
           <w:b/>
           <w:bCs/>
-        </w:rPr>
-        <w:t xml:space="preserve">  Staging:     </w:t>
-      </w:r>
-      <w:r>
-        <w:rPr>
-          <w:i/>
-          <w:iCs/>
-          <w:color w:val="595959"/>
-        </w:rPr>
-        <w:t>[Paste Render Staging Service URL Here]</w:t>
+          <w:color w:val="1F3864"/>
+        </w:rPr>
+        <w:t>Deployed Application URLs:</w:t>
       </w:r>
     </w:p>
     <w:p>
@@ -1623,15 +1756,55 @@
           <w:b/>
           <w:bCs/>
         </w:rPr>
-        <w:t xml:space="preserve">  Production:  </w:t>
-      </w:r>
-      <w:r>
-        <w:rPr>
-          <w:i/>
-          <w:iCs/>
-          <w:color w:val="595959"/>
-        </w:rPr>
-        <w:t>[Paste Render Production Service URL Here]</w:t>
+        <w:t xml:space="preserve">  Development:</w:t>
+      </w:r>
+      <w:r>
+        <w:t xml:space="preserve"> </w:t>
+      </w:r>
+      <w:r>
+        <w:rPr>
+          <w:b/>
+          <w:bCs/>
+        </w:rPr>
+        <w:t>https://pakvista-cicd-dev-latest.onrender.com</w:t>
+      </w:r>
+    </w:p>
+    <w:p>
+      <w:pPr>
+        <w:spacing w:before="60" w:after="60" w:line="276" w:lineRule="auto"/>
+      </w:pPr>
+      <w:r>
+        <w:rPr>
+          <w:b/>
+          <w:bCs/>
+        </w:rPr>
+        <w:t xml:space="preserve">  Staging:    </w:t>
+      </w:r>
+      <w:r>
+        <w:rPr>
+          <w:b/>
+          <w:bCs/>
+        </w:rPr>
+        <w:t>https://pakvista-staging-x7qv.onrender.com</w:t>
+      </w:r>
+    </w:p>
+    <w:p>
+      <w:pPr>
+        <w:spacing w:before="60" w:after="60" w:line="276" w:lineRule="auto"/>
+      </w:pPr>
+      <w:r>
+        <w:rPr>
+          <w:b/>
+          <w:bCs/>
+        </w:rPr>
+        <w:t xml:space="preserve">  Production: </w:t>
+      </w:r>
+      <w:r>
+        <w:rPr>
+          <w:b/>
+          <w:bCs/>
+        </w:rPr>
+        <w:t>https://pakvista-prod-hfvt.onrender.com</w:t>
       </w:r>
     </w:p>
     <w:p/>
@@ -1648,6 +1821,7 @@
         <w:spacing w:before="60" w:after="60" w:line="276" w:lineRule="auto"/>
       </w:pPr>
       <w:r>
+        <w:lastRenderedPageBreak/>
         <w:t xml:space="preserve">Your team is the engineering crew for </w:t>
       </w:r>
       <w:r>
@@ -1871,7 +2045,6 @@
                 <w:sz w:val="20"/>
                 <w:szCs w:val="20"/>
               </w:rPr>
-              <w:lastRenderedPageBreak/>
               <w:t>Development</w:t>
             </w:r>
           </w:p>
@@ -3019,6 +3192,7 @@
         <w:pStyle w:val="Heading2"/>
       </w:pPr>
       <w:r>
+        <w:lastRenderedPageBreak/>
         <w:t>Table 3: Workflow File Assignment</w:t>
       </w:r>
     </w:p>
@@ -3387,16 +3561,7 @@
                 <w:sz w:val="20"/>
                 <w:szCs w:val="20"/>
               </w:rPr>
-              <w:t xml:space="preserve"> HTML &amp; CSS Linting, Building with </w:t>
-            </w:r>
-            <w:r>
-              <w:rPr>
-                <w:color w:val="000000"/>
-                <w:sz w:val="20"/>
-                <w:szCs w:val="20"/>
-              </w:rPr>
-              <w:lastRenderedPageBreak/>
-              <w:t>Parcel,</w:t>
+              <w:t xml:space="preserve"> HTML &amp; CSS Linting, Building with Parcel,</w:t>
             </w:r>
             <w:r>
               <w:rPr>
@@ -3440,7 +3605,6 @@
                 <w:sz w:val="20"/>
                 <w:szCs w:val="20"/>
               </w:rPr>
-              <w:lastRenderedPageBreak/>
               <w:t>2</w:t>
             </w:r>
           </w:p>
@@ -4355,6 +4519,7 @@
         <w:rPr>
           <w:color w:val="000000"/>
         </w:rPr>
+        <w:lastRenderedPageBreak/>
         <w:t>Complete automated flow:</w:t>
       </w:r>
     </w:p>
@@ -12809,8 +12974,8 @@
         <w:tblLook w:val="04A0" w:firstRow="1" w:lastRow="0" w:firstColumn="1" w:lastColumn="0" w:noHBand="0" w:noVBand="1"/>
       </w:tblPr>
       <w:tblGrid>
-        <w:gridCol w:w="3200"/>
-        <w:gridCol w:w="6160"/>
+        <w:gridCol w:w="1378"/>
+        <w:gridCol w:w="8700"/>
       </w:tblGrid>
       <w:tr>
         <w:tc>
@@ -12910,6 +13075,7 @@
                 <w:sz w:val="20"/>
                 <w:szCs w:val="20"/>
               </w:rPr>
+              <w:lastRenderedPageBreak/>
               <w:t>GitHub Environments (development, staging, production) &amp; All Secrets</w:t>
             </w:r>
           </w:p>
@@ -12940,61 +13106,61 @@
                 <w:sz w:val="20"/>
                 <w:szCs w:val="20"/>
               </w:rPr>
-              <w:t>[Paste screenshot here]</w:t>
-            </w:r>
-          </w:p>
-        </w:tc>
-      </w:tr>
-      <w:tr>
-        <w:tc>
-          <w:tcPr>
-            <w:tcW w:w="3200" w:type="dxa"/>
-            <w:tcBorders>
-              <w:top w:val="single" w:sz="1" w:space="0" w:color="AAAAAA"/>
-              <w:left w:val="single" w:sz="1" w:space="0" w:color="AAAAAA"/>
-              <w:bottom w:val="single" w:sz="1" w:space="0" w:color="AAAAAA"/>
-              <w:right w:val="single" w:sz="1" w:space="0" w:color="AAAAAA"/>
-            </w:tcBorders>
-            <w:shd w:val="clear" w:color="auto" w:fill="FFFFFF"/>
-            <w:tcMar>
-              <w:top w:w="80" w:type="dxa"/>
-              <w:left w:w="120" w:type="dxa"/>
-              <w:bottom w:w="80" w:type="dxa"/>
-              <w:right w:w="120" w:type="dxa"/>
-            </w:tcMar>
-            <w:vAlign w:val="center"/>
-          </w:tcPr>
-          <w:p>
-            <w:r>
-              <w:rPr>
-                <w:b/>
-                <w:bCs/>
-                <w:color w:val="000000"/>
-                <w:sz w:val="20"/>
-                <w:szCs w:val="20"/>
-              </w:rPr>
-              <w:t>CI Workflow Runs – Triggered by each member's PR on develop (all steps green)</w:t>
-            </w:r>
-          </w:p>
-        </w:tc>
-        <w:tc>
-          <w:tcPr>
-            <w:tcW w:w="6160" w:type="dxa"/>
-            <w:tcBorders>
-              <w:top w:val="single" w:sz="1" w:space="0" w:color="AAAAAA"/>
-              <w:left w:val="single" w:sz="1" w:space="0" w:color="AAAAAA"/>
-              <w:bottom w:val="single" w:sz="1" w:space="0" w:color="AAAAAA"/>
-              <w:right w:val="single" w:sz="1" w:space="0" w:color="AAAAAA"/>
-            </w:tcBorders>
-            <w:shd w:val="clear" w:color="auto" w:fill="FFFFFF"/>
-            <w:tcMar>
-              <w:top w:w="80" w:type="dxa"/>
-              <w:left w:w="120" w:type="dxa"/>
-              <w:bottom w:w="80" w:type="dxa"/>
-              <w:right w:w="120" w:type="dxa"/>
-            </w:tcMar>
-          </w:tcPr>
-          <w:p>
+              <w:t xml:space="preserve">[Paste screenshot </w:t>
+            </w:r>
+            <w:r>
+              <w:rPr>
+                <w:noProof/>
+              </w:rPr>
+              <w:drawing>
+                <wp:inline distT="0" distB="0" distL="0" distR="0" wp14:anchorId="1C9269FB" wp14:editId="09272DAC">
+                  <wp:extent cx="6400800" cy="3466465"/>
+                  <wp:effectExtent l="0" t="0" r="0" b="635"/>
+                  <wp:docPr id="1338485419" name="Picture 7"/>
+                  <wp:cNvGraphicFramePr>
+                    <a:graphicFrameLocks xmlns:a="http://schemas.openxmlformats.org/drawingml/2006/main" noChangeAspect="1"/>
+                  </wp:cNvGraphicFramePr>
+                  <a:graphic xmlns:a="http://schemas.openxmlformats.org/drawingml/2006/main">
+                    <a:graphicData uri="http://schemas.openxmlformats.org/drawingml/2006/picture">
+                      <pic:pic xmlns:pic="http://schemas.openxmlformats.org/drawingml/2006/picture">
+                        <pic:nvPicPr>
+                          <pic:cNvPr id="0" name="Picture 11"/>
+                          <pic:cNvPicPr>
+                            <a:picLocks noChangeAspect="1" noChangeArrowheads="1"/>
+                          </pic:cNvPicPr>
+                        </pic:nvPicPr>
+                        <pic:blipFill>
+                          <a:blip r:embed="rId7" cstate="print">
+                            <a:extLst>
+                              <a:ext uri="{28A0092B-C50C-407E-A947-70E740481C1C}">
+                                <a14:useLocalDpi xmlns:a14="http://schemas.microsoft.com/office/drawing/2010/main" val="0"/>
+                              </a:ext>
+                            </a:extLst>
+                          </a:blip>
+                          <a:srcRect/>
+                          <a:stretch>
+                            <a:fillRect/>
+                          </a:stretch>
+                        </pic:blipFill>
+                        <pic:spPr bwMode="auto">
+                          <a:xfrm>
+                            <a:off x="0" y="0"/>
+                            <a:ext cx="6400800" cy="3466465"/>
+                          </a:xfrm>
+                          <a:prstGeom prst="rect">
+                            <a:avLst/>
+                          </a:prstGeom>
+                          <a:noFill/>
+                          <a:ln>
+                            <a:noFill/>
+                          </a:ln>
+                        </pic:spPr>
+                      </pic:pic>
+                    </a:graphicData>
+                  </a:graphic>
+                </wp:inline>
+              </w:drawing>
+            </w:r>
             <w:r>
               <w:rPr>
                 <w:i/>
@@ -13003,7 +13169,7 @@
                 <w:sz w:val="20"/>
                 <w:szCs w:val="20"/>
               </w:rPr>
-              <w:t>[Paste screenshot here]</w:t>
+              <w:t>here]</w:t>
             </w:r>
           </w:p>
         </w:tc>
@@ -13018,7 +13184,7 @@
               <w:bottom w:val="single" w:sz="1" w:space="0" w:color="AAAAAA"/>
               <w:right w:val="single" w:sz="1" w:space="0" w:color="AAAAAA"/>
             </w:tcBorders>
-            <w:shd w:val="clear" w:color="auto" w:fill="EBF3FA"/>
+            <w:shd w:val="clear" w:color="auto" w:fill="FFFFFF"/>
             <w:tcMar>
               <w:top w:w="80" w:type="dxa"/>
               <w:left w:w="120" w:type="dxa"/>
@@ -13036,7 +13202,7 @@
                 <w:sz w:val="20"/>
                 <w:szCs w:val="20"/>
               </w:rPr>
-              <w:t>Docker Hub – Pushed Images with All Environment Tags (dev, staging, prod)</w:t>
+              <w:t>CI Workflow Runs – Triggered by each member's PR on develop (all steps green)</w:t>
             </w:r>
           </w:p>
         </w:tc>
@@ -13049,7 +13215,7 @@
               <w:bottom w:val="single" w:sz="1" w:space="0" w:color="AAAAAA"/>
               <w:right w:val="single" w:sz="1" w:space="0" w:color="AAAAAA"/>
             </w:tcBorders>
-            <w:shd w:val="clear" w:color="auto" w:fill="EBF3FA"/>
+            <w:shd w:val="clear" w:color="auto" w:fill="FFFFFF"/>
             <w:tcMar>
               <w:top w:w="80" w:type="dxa"/>
               <w:left w:w="120" w:type="dxa"/>
@@ -13066,61 +13232,61 @@
                 <w:sz w:val="20"/>
                 <w:szCs w:val="20"/>
               </w:rPr>
-              <w:t>[Paste screenshot here]</w:t>
-            </w:r>
-          </w:p>
-        </w:tc>
-      </w:tr>
-      <w:tr>
-        <w:tc>
-          <w:tcPr>
-            <w:tcW w:w="3200" w:type="dxa"/>
-            <w:tcBorders>
-              <w:top w:val="single" w:sz="1" w:space="0" w:color="AAAAAA"/>
-              <w:left w:val="single" w:sz="1" w:space="0" w:color="AAAAAA"/>
-              <w:bottom w:val="single" w:sz="1" w:space="0" w:color="AAAAAA"/>
-              <w:right w:val="single" w:sz="1" w:space="0" w:color="AAAAAA"/>
-            </w:tcBorders>
-            <w:shd w:val="clear" w:color="auto" w:fill="FFFFFF"/>
-            <w:tcMar>
-              <w:top w:w="80" w:type="dxa"/>
-              <w:left w:w="120" w:type="dxa"/>
-              <w:bottom w:w="80" w:type="dxa"/>
-              <w:right w:w="120" w:type="dxa"/>
-            </w:tcMar>
-            <w:vAlign w:val="center"/>
-          </w:tcPr>
-          <w:p>
-            <w:r>
-              <w:rPr>
-                <w:b/>
-                <w:bCs/>
-                <w:color w:val="000000"/>
-                <w:sz w:val="20"/>
-                <w:szCs w:val="20"/>
-              </w:rPr>
-              <w:t>CD Workflow Runs – All three environments triggered by push events</w:t>
-            </w:r>
-          </w:p>
-        </w:tc>
-        <w:tc>
-          <w:tcPr>
-            <w:tcW w:w="6160" w:type="dxa"/>
-            <w:tcBorders>
-              <w:top w:val="single" w:sz="1" w:space="0" w:color="AAAAAA"/>
-              <w:left w:val="single" w:sz="1" w:space="0" w:color="AAAAAA"/>
-              <w:bottom w:val="single" w:sz="1" w:space="0" w:color="AAAAAA"/>
-              <w:right w:val="single" w:sz="1" w:space="0" w:color="AAAAAA"/>
-            </w:tcBorders>
-            <w:shd w:val="clear" w:color="auto" w:fill="FFFFFF"/>
-            <w:tcMar>
-              <w:top w:w="80" w:type="dxa"/>
-              <w:left w:w="120" w:type="dxa"/>
-              <w:bottom w:w="80" w:type="dxa"/>
-              <w:right w:w="120" w:type="dxa"/>
-            </w:tcMar>
-          </w:tcPr>
-          <w:p>
+              <w:t xml:space="preserve">[Paste screenshot </w:t>
+            </w:r>
+            <w:r>
+              <w:rPr>
+                <w:noProof/>
+              </w:rPr>
+              <w:drawing>
+                <wp:inline distT="0" distB="0" distL="0" distR="0" wp14:anchorId="63027207" wp14:editId="17C55A55">
+                  <wp:extent cx="6400800" cy="3466465"/>
+                  <wp:effectExtent l="0" t="0" r="0" b="635"/>
+                  <wp:docPr id="997318559" name="Picture 2"/>
+                  <wp:cNvGraphicFramePr>
+                    <a:graphicFrameLocks xmlns:a="http://schemas.openxmlformats.org/drawingml/2006/main" noChangeAspect="1"/>
+                  </wp:cNvGraphicFramePr>
+                  <a:graphic xmlns:a="http://schemas.openxmlformats.org/drawingml/2006/main">
+                    <a:graphicData uri="http://schemas.openxmlformats.org/drawingml/2006/picture">
+                      <pic:pic xmlns:pic="http://schemas.openxmlformats.org/drawingml/2006/picture">
+                        <pic:nvPicPr>
+                          <pic:cNvPr id="0" name="Picture 2"/>
+                          <pic:cNvPicPr>
+                            <a:picLocks noChangeAspect="1" noChangeArrowheads="1"/>
+                          </pic:cNvPicPr>
+                        </pic:nvPicPr>
+                        <pic:blipFill>
+                          <a:blip r:embed="rId8" cstate="print">
+                            <a:extLst>
+                              <a:ext uri="{28A0092B-C50C-407E-A947-70E740481C1C}">
+                                <a14:useLocalDpi xmlns:a14="http://schemas.microsoft.com/office/drawing/2010/main" val="0"/>
+                              </a:ext>
+                            </a:extLst>
+                          </a:blip>
+                          <a:srcRect/>
+                          <a:stretch>
+                            <a:fillRect/>
+                          </a:stretch>
+                        </pic:blipFill>
+                        <pic:spPr bwMode="auto">
+                          <a:xfrm>
+                            <a:off x="0" y="0"/>
+                            <a:ext cx="6400800" cy="3466465"/>
+                          </a:xfrm>
+                          <a:prstGeom prst="rect">
+                            <a:avLst/>
+                          </a:prstGeom>
+                          <a:noFill/>
+                          <a:ln>
+                            <a:noFill/>
+                          </a:ln>
+                        </pic:spPr>
+                      </pic:pic>
+                    </a:graphicData>
+                  </a:graphic>
+                </wp:inline>
+              </w:drawing>
+            </w:r>
             <w:r>
               <w:rPr>
                 <w:i/>
@@ -13129,7 +13295,7 @@
                 <w:sz w:val="20"/>
                 <w:szCs w:val="20"/>
               </w:rPr>
-              <w:t>[Paste screenshot here]</w:t>
+              <w:t>here]</w:t>
             </w:r>
           </w:p>
         </w:tc>
@@ -13162,7 +13328,8 @@
                 <w:sz w:val="20"/>
                 <w:szCs w:val="20"/>
               </w:rPr>
-              <w:t>Live PakVista – Development Render Service (all 5 pages accessible)</w:t>
+              <w:lastRenderedPageBreak/>
+              <w:t>Docker Hub – Pushed Images with All Environment Tags (dev, staging, prod)</w:t>
             </w:r>
           </w:p>
         </w:tc>
@@ -13192,61 +13359,8 @@
                 <w:sz w:val="20"/>
                 <w:szCs w:val="20"/>
               </w:rPr>
-              <w:t>[Paste screenshot here]</w:t>
-            </w:r>
-          </w:p>
-        </w:tc>
-      </w:tr>
-      <w:tr>
-        <w:tc>
-          <w:tcPr>
-            <w:tcW w:w="3200" w:type="dxa"/>
-            <w:tcBorders>
-              <w:top w:val="single" w:sz="1" w:space="0" w:color="AAAAAA"/>
-              <w:left w:val="single" w:sz="1" w:space="0" w:color="AAAAAA"/>
-              <w:bottom w:val="single" w:sz="1" w:space="0" w:color="AAAAAA"/>
-              <w:right w:val="single" w:sz="1" w:space="0" w:color="AAAAAA"/>
-            </w:tcBorders>
-            <w:shd w:val="clear" w:color="auto" w:fill="FFFFFF"/>
-            <w:tcMar>
-              <w:top w:w="80" w:type="dxa"/>
-              <w:left w:w="120" w:type="dxa"/>
-              <w:bottom w:w="80" w:type="dxa"/>
-              <w:right w:w="120" w:type="dxa"/>
-            </w:tcMar>
-            <w:vAlign w:val="center"/>
-          </w:tcPr>
-          <w:p>
-            <w:r>
-              <w:rPr>
-                <w:b/>
-                <w:bCs/>
-                <w:color w:val="000000"/>
-                <w:sz w:val="20"/>
-                <w:szCs w:val="20"/>
-              </w:rPr>
-              <w:t>Live PakVista – Staging Render Service (all 5 pages accessible)</w:t>
-            </w:r>
-          </w:p>
-        </w:tc>
-        <w:tc>
-          <w:tcPr>
-            <w:tcW w:w="6160" w:type="dxa"/>
-            <w:tcBorders>
-              <w:top w:val="single" w:sz="1" w:space="0" w:color="AAAAAA"/>
-              <w:left w:val="single" w:sz="1" w:space="0" w:color="AAAAAA"/>
-              <w:bottom w:val="single" w:sz="1" w:space="0" w:color="AAAAAA"/>
-              <w:right w:val="single" w:sz="1" w:space="0" w:color="AAAAAA"/>
-            </w:tcBorders>
-            <w:shd w:val="clear" w:color="auto" w:fill="FFFFFF"/>
-            <w:tcMar>
-              <w:top w:w="80" w:type="dxa"/>
-              <w:left w:w="120" w:type="dxa"/>
-              <w:bottom w:w="80" w:type="dxa"/>
-              <w:right w:w="120" w:type="dxa"/>
-            </w:tcMar>
-          </w:tcPr>
-          <w:p>
+              <w:t>[Paste screenshot</w:t>
+            </w:r>
             <w:r>
               <w:rPr>
                 <w:i/>
@@ -13255,62 +13369,42 @@
                 <w:sz w:val="20"/>
                 <w:szCs w:val="20"/>
               </w:rPr>
-              <w:t>[Paste screenshot here]</w:t>
-            </w:r>
-          </w:p>
-        </w:tc>
-      </w:tr>
-      <w:tr>
-        <w:tc>
-          <w:tcPr>
-            <w:tcW w:w="3200" w:type="dxa"/>
-            <w:tcBorders>
-              <w:top w:val="single" w:sz="1" w:space="0" w:color="AAAAAA"/>
-              <w:left w:val="single" w:sz="1" w:space="0" w:color="AAAAAA"/>
-              <w:bottom w:val="single" w:sz="1" w:space="0" w:color="AAAAAA"/>
-              <w:right w:val="single" w:sz="1" w:space="0" w:color="AAAAAA"/>
-            </w:tcBorders>
-            <w:shd w:val="clear" w:color="auto" w:fill="EBF3FA"/>
-            <w:tcMar>
-              <w:top w:w="80" w:type="dxa"/>
-              <w:left w:w="120" w:type="dxa"/>
-              <w:bottom w:w="80" w:type="dxa"/>
-              <w:right w:w="120" w:type="dxa"/>
-            </w:tcMar>
-            <w:vAlign w:val="center"/>
-          </w:tcPr>
-          <w:p>
-            <w:r>
-              <w:rPr>
-                <w:b/>
-                <w:bCs/>
-                <w:color w:val="000000"/>
-                <w:sz w:val="20"/>
-                <w:szCs w:val="20"/>
-              </w:rPr>
-              <w:lastRenderedPageBreak/>
-              <w:t>Live PakVista – Production Render Service (all 5 pages accessible)</w:t>
-            </w:r>
-          </w:p>
-        </w:tc>
-        <w:tc>
-          <w:tcPr>
-            <w:tcW w:w="6160" w:type="dxa"/>
-            <w:tcBorders>
-              <w:top w:val="single" w:sz="1" w:space="0" w:color="AAAAAA"/>
-              <w:left w:val="single" w:sz="1" w:space="0" w:color="AAAAAA"/>
-              <w:bottom w:val="single" w:sz="1" w:space="0" w:color="AAAAAA"/>
-              <w:right w:val="single" w:sz="1" w:space="0" w:color="AAAAAA"/>
-            </w:tcBorders>
-            <w:shd w:val="clear" w:color="auto" w:fill="EBF3FA"/>
-            <w:tcMar>
-              <w:top w:w="80" w:type="dxa"/>
-              <w:left w:w="120" w:type="dxa"/>
-              <w:bottom w:w="80" w:type="dxa"/>
-              <w:right w:w="120" w:type="dxa"/>
-            </w:tcMar>
-          </w:tcPr>
-          <w:p>
+              <w:drawing>
+                <wp:inline distT="0" distB="0" distL="0" distR="0" wp14:anchorId="1794365D" wp14:editId="2BF6416A">
+                  <wp:extent cx="6400800" cy="3467100"/>
+                  <wp:effectExtent l="0" t="0" r="0" b="0"/>
+                  <wp:docPr id="2375733" name="Picture 1"/>
+                  <wp:cNvGraphicFramePr>
+                    <a:graphicFrameLocks xmlns:a="http://schemas.openxmlformats.org/drawingml/2006/main" noChangeAspect="1"/>
+                  </wp:cNvGraphicFramePr>
+                  <a:graphic xmlns:a="http://schemas.openxmlformats.org/drawingml/2006/main">
+                    <a:graphicData uri="http://schemas.openxmlformats.org/drawingml/2006/picture">
+                      <pic:pic xmlns:pic="http://schemas.openxmlformats.org/drawingml/2006/picture">
+                        <pic:nvPicPr>
+                          <pic:cNvPr id="2375733" name=""/>
+                          <pic:cNvPicPr/>
+                        </pic:nvPicPr>
+                        <pic:blipFill>
+                          <a:blip r:embed="rId9"/>
+                          <a:stretch>
+                            <a:fillRect/>
+                          </a:stretch>
+                        </pic:blipFill>
+                        <pic:spPr>
+                          <a:xfrm>
+                            <a:off x="0" y="0"/>
+                            <a:ext cx="6400800" cy="3467100"/>
+                          </a:xfrm>
+                          <a:prstGeom prst="rect">
+                            <a:avLst/>
+                          </a:prstGeom>
+                        </pic:spPr>
+                      </pic:pic>
+                    </a:graphicData>
+                  </a:graphic>
+                </wp:inline>
+              </w:drawing>
+            </w:r>
             <w:r>
               <w:rPr>
                 <w:i/>
@@ -13319,7 +13413,7 @@
                 <w:sz w:val="20"/>
                 <w:szCs w:val="20"/>
               </w:rPr>
-              <w:t>[Paste screenshot here]</w:t>
+              <w:t xml:space="preserve"> here]</w:t>
             </w:r>
           </w:p>
         </w:tc>
@@ -13352,7 +13446,7 @@
                 <w:sz w:val="20"/>
                 <w:szCs w:val="20"/>
               </w:rPr>
-              <w:t>Term Project .docx visible in GitHub Repository file listing</w:t>
+              <w:t>CD Workflow Runs – All three environments triggered by push events</w:t>
             </w:r>
           </w:p>
         </w:tc>
@@ -13382,18 +13476,559 @@
                 <w:sz w:val="20"/>
                 <w:szCs w:val="20"/>
               </w:rPr>
+              <w:t>[Paste sc</w:t>
+            </w:r>
+            <w:r>
+              <w:rPr>
+                <w:noProof/>
+              </w:rPr>
+              <w:drawing>
+                <wp:inline distT="0" distB="0" distL="0" distR="0" wp14:anchorId="59669768" wp14:editId="4EF49357">
+                  <wp:extent cx="6400800" cy="3466465"/>
+                  <wp:effectExtent l="0" t="0" r="0" b="635"/>
+                  <wp:docPr id="812436148" name="Picture 3"/>
+                  <wp:cNvGraphicFramePr>
+                    <a:graphicFrameLocks xmlns:a="http://schemas.openxmlformats.org/drawingml/2006/main" noChangeAspect="1"/>
+                  </wp:cNvGraphicFramePr>
+                  <a:graphic xmlns:a="http://schemas.openxmlformats.org/drawingml/2006/main">
+                    <a:graphicData uri="http://schemas.openxmlformats.org/drawingml/2006/picture">
+                      <pic:pic xmlns:pic="http://schemas.openxmlformats.org/drawingml/2006/picture">
+                        <pic:nvPicPr>
+                          <pic:cNvPr id="0" name="Picture 4"/>
+                          <pic:cNvPicPr>
+                            <a:picLocks noChangeAspect="1" noChangeArrowheads="1"/>
+                          </pic:cNvPicPr>
+                        </pic:nvPicPr>
+                        <pic:blipFill>
+                          <a:blip r:embed="rId10" cstate="print">
+                            <a:extLst>
+                              <a:ext uri="{28A0092B-C50C-407E-A947-70E740481C1C}">
+                                <a14:useLocalDpi xmlns:a14="http://schemas.microsoft.com/office/drawing/2010/main" val="0"/>
+                              </a:ext>
+                            </a:extLst>
+                          </a:blip>
+                          <a:srcRect/>
+                          <a:stretch>
+                            <a:fillRect/>
+                          </a:stretch>
+                        </pic:blipFill>
+                        <pic:spPr bwMode="auto">
+                          <a:xfrm>
+                            <a:off x="0" y="0"/>
+                            <a:ext cx="6400800" cy="3466465"/>
+                          </a:xfrm>
+                          <a:prstGeom prst="rect">
+                            <a:avLst/>
+                          </a:prstGeom>
+                          <a:noFill/>
+                          <a:ln>
+                            <a:noFill/>
+                          </a:ln>
+                        </pic:spPr>
+                      </pic:pic>
+                    </a:graphicData>
+                  </a:graphic>
+                </wp:inline>
+              </w:drawing>
+            </w:r>
+            <w:r>
+              <w:rPr>
+                <w:i/>
+                <w:iCs/>
+                <w:color w:val="595959"/>
+                <w:sz w:val="20"/>
+                <w:szCs w:val="20"/>
+              </w:rPr>
+              <w:t>reenshot here]</w:t>
+            </w:r>
+          </w:p>
+        </w:tc>
+      </w:tr>
+      <w:tr>
+        <w:tc>
+          <w:tcPr>
+            <w:tcW w:w="3200" w:type="dxa"/>
+            <w:tcBorders>
+              <w:top w:val="single" w:sz="1" w:space="0" w:color="AAAAAA"/>
+              <w:left w:val="single" w:sz="1" w:space="0" w:color="AAAAAA"/>
+              <w:bottom w:val="single" w:sz="1" w:space="0" w:color="AAAAAA"/>
+              <w:right w:val="single" w:sz="1" w:space="0" w:color="AAAAAA"/>
+            </w:tcBorders>
+            <w:shd w:val="clear" w:color="auto" w:fill="EBF3FA"/>
+            <w:tcMar>
+              <w:top w:w="80" w:type="dxa"/>
+              <w:left w:w="120" w:type="dxa"/>
+              <w:bottom w:w="80" w:type="dxa"/>
+              <w:right w:w="120" w:type="dxa"/>
+            </w:tcMar>
+            <w:vAlign w:val="center"/>
+          </w:tcPr>
+          <w:p>
+            <w:r>
+              <w:rPr>
+                <w:b/>
+                <w:bCs/>
+                <w:color w:val="000000"/>
+                <w:sz w:val="20"/>
+                <w:szCs w:val="20"/>
+              </w:rPr>
+              <w:lastRenderedPageBreak/>
+              <w:t>Live PakVista – Development Render Service (all 5 pages accessible)</w:t>
+            </w:r>
+          </w:p>
+        </w:tc>
+        <w:tc>
+          <w:tcPr>
+            <w:tcW w:w="6160" w:type="dxa"/>
+            <w:tcBorders>
+              <w:top w:val="single" w:sz="1" w:space="0" w:color="AAAAAA"/>
+              <w:left w:val="single" w:sz="1" w:space="0" w:color="AAAAAA"/>
+              <w:bottom w:val="single" w:sz="1" w:space="0" w:color="AAAAAA"/>
+              <w:right w:val="single" w:sz="1" w:space="0" w:color="AAAAAA"/>
+            </w:tcBorders>
+            <w:shd w:val="clear" w:color="auto" w:fill="EBF3FA"/>
+            <w:tcMar>
+              <w:top w:w="80" w:type="dxa"/>
+              <w:left w:w="120" w:type="dxa"/>
+              <w:bottom w:w="80" w:type="dxa"/>
+              <w:right w:w="120" w:type="dxa"/>
+            </w:tcMar>
+          </w:tcPr>
+          <w:p>
+            <w:r>
+              <w:rPr>
+                <w:i/>
+                <w:iCs/>
+                <w:color w:val="595959"/>
+                <w:sz w:val="20"/>
+                <w:szCs w:val="20"/>
+              </w:rPr>
               <w:t>[Paste screenshot here]</w:t>
+            </w:r>
+            <w:r>
+              <w:t xml:space="preserve"> </w:t>
+            </w:r>
+            <w:r>
+              <w:rPr>
+                <w:noProof/>
+              </w:rPr>
+              <w:drawing>
+                <wp:inline distT="0" distB="0" distL="0" distR="0" wp14:anchorId="38199A0B" wp14:editId="58FF2328">
+                  <wp:extent cx="6400800" cy="3466465"/>
+                  <wp:effectExtent l="0" t="0" r="0" b="635"/>
+                  <wp:docPr id="1559401493" name="Picture 4"/>
+                  <wp:cNvGraphicFramePr>
+                    <a:graphicFrameLocks xmlns:a="http://schemas.openxmlformats.org/drawingml/2006/main" noChangeAspect="1"/>
+                  </wp:cNvGraphicFramePr>
+                  <a:graphic xmlns:a="http://schemas.openxmlformats.org/drawingml/2006/main">
+                    <a:graphicData uri="http://schemas.openxmlformats.org/drawingml/2006/picture">
+                      <pic:pic xmlns:pic="http://schemas.openxmlformats.org/drawingml/2006/picture">
+                        <pic:nvPicPr>
+                          <pic:cNvPr id="0" name="Picture 6"/>
+                          <pic:cNvPicPr>
+                            <a:picLocks noChangeAspect="1" noChangeArrowheads="1"/>
+                          </pic:cNvPicPr>
+                        </pic:nvPicPr>
+                        <pic:blipFill>
+                          <a:blip r:embed="rId11" cstate="print">
+                            <a:extLst>
+                              <a:ext uri="{28A0092B-C50C-407E-A947-70E740481C1C}">
+                                <a14:useLocalDpi xmlns:a14="http://schemas.microsoft.com/office/drawing/2010/main" val="0"/>
+                              </a:ext>
+                            </a:extLst>
+                          </a:blip>
+                          <a:srcRect/>
+                          <a:stretch>
+                            <a:fillRect/>
+                          </a:stretch>
+                        </pic:blipFill>
+                        <pic:spPr bwMode="auto">
+                          <a:xfrm>
+                            <a:off x="0" y="0"/>
+                            <a:ext cx="6400800" cy="3466465"/>
+                          </a:xfrm>
+                          <a:prstGeom prst="rect">
+                            <a:avLst/>
+                          </a:prstGeom>
+                          <a:noFill/>
+                          <a:ln>
+                            <a:noFill/>
+                          </a:ln>
+                        </pic:spPr>
+                      </pic:pic>
+                    </a:graphicData>
+                  </a:graphic>
+                </wp:inline>
+              </w:drawing>
+            </w:r>
+          </w:p>
+        </w:tc>
+      </w:tr>
+      <w:tr>
+        <w:tc>
+          <w:tcPr>
+            <w:tcW w:w="3200" w:type="dxa"/>
+            <w:tcBorders>
+              <w:top w:val="single" w:sz="1" w:space="0" w:color="AAAAAA"/>
+              <w:left w:val="single" w:sz="1" w:space="0" w:color="AAAAAA"/>
+              <w:bottom w:val="single" w:sz="1" w:space="0" w:color="AAAAAA"/>
+              <w:right w:val="single" w:sz="1" w:space="0" w:color="AAAAAA"/>
+            </w:tcBorders>
+            <w:shd w:val="clear" w:color="auto" w:fill="FFFFFF"/>
+            <w:tcMar>
+              <w:top w:w="80" w:type="dxa"/>
+              <w:left w:w="120" w:type="dxa"/>
+              <w:bottom w:w="80" w:type="dxa"/>
+              <w:right w:w="120" w:type="dxa"/>
+            </w:tcMar>
+            <w:vAlign w:val="center"/>
+          </w:tcPr>
+          <w:p>
+            <w:r>
+              <w:rPr>
+                <w:b/>
+                <w:bCs/>
+                <w:color w:val="000000"/>
+                <w:sz w:val="20"/>
+                <w:szCs w:val="20"/>
+              </w:rPr>
+              <w:t>Live PakVista – Staging Render Service (all 5 pages accessible)</w:t>
+            </w:r>
+          </w:p>
+        </w:tc>
+        <w:tc>
+          <w:tcPr>
+            <w:tcW w:w="6160" w:type="dxa"/>
+            <w:tcBorders>
+              <w:top w:val="single" w:sz="1" w:space="0" w:color="AAAAAA"/>
+              <w:left w:val="single" w:sz="1" w:space="0" w:color="AAAAAA"/>
+              <w:bottom w:val="single" w:sz="1" w:space="0" w:color="AAAAAA"/>
+              <w:right w:val="single" w:sz="1" w:space="0" w:color="AAAAAA"/>
+            </w:tcBorders>
+            <w:shd w:val="clear" w:color="auto" w:fill="FFFFFF"/>
+            <w:tcMar>
+              <w:top w:w="80" w:type="dxa"/>
+              <w:left w:w="120" w:type="dxa"/>
+              <w:bottom w:w="80" w:type="dxa"/>
+              <w:right w:w="120" w:type="dxa"/>
+            </w:tcMar>
+          </w:tcPr>
+          <w:p>
+            <w:r>
+              <w:rPr>
+                <w:i/>
+                <w:iCs/>
+                <w:color w:val="595959"/>
+                <w:sz w:val="20"/>
+                <w:szCs w:val="20"/>
+              </w:rPr>
+              <w:t>[Paste screenshot here]</w:t>
+            </w:r>
+            <w:r>
+              <w:t xml:space="preserve"> </w:t>
+            </w:r>
+            <w:r>
+              <w:rPr>
+                <w:noProof/>
+              </w:rPr>
+              <w:drawing>
+                <wp:inline distT="0" distB="0" distL="0" distR="0" wp14:anchorId="030B31DE" wp14:editId="65E68EBF">
+                  <wp:extent cx="6400800" cy="3466465"/>
+                  <wp:effectExtent l="0" t="0" r="0" b="635"/>
+                  <wp:docPr id="1445569892" name="Picture 5"/>
+                  <wp:cNvGraphicFramePr>
+                    <a:graphicFrameLocks xmlns:a="http://schemas.openxmlformats.org/drawingml/2006/main" noChangeAspect="1"/>
+                  </wp:cNvGraphicFramePr>
+                  <a:graphic xmlns:a="http://schemas.openxmlformats.org/drawingml/2006/main">
+                    <a:graphicData uri="http://schemas.openxmlformats.org/drawingml/2006/picture">
+                      <pic:pic xmlns:pic="http://schemas.openxmlformats.org/drawingml/2006/picture">
+                        <pic:nvPicPr>
+                          <pic:cNvPr id="0" name="Picture 8"/>
+                          <pic:cNvPicPr>
+                            <a:picLocks noChangeAspect="1" noChangeArrowheads="1"/>
+                          </pic:cNvPicPr>
+                        </pic:nvPicPr>
+                        <pic:blipFill>
+                          <a:blip r:embed="rId12" cstate="print">
+                            <a:extLst>
+                              <a:ext uri="{28A0092B-C50C-407E-A947-70E740481C1C}">
+                                <a14:useLocalDpi xmlns:a14="http://schemas.microsoft.com/office/drawing/2010/main" val="0"/>
+                              </a:ext>
+                            </a:extLst>
+                          </a:blip>
+                          <a:srcRect/>
+                          <a:stretch>
+                            <a:fillRect/>
+                          </a:stretch>
+                        </pic:blipFill>
+                        <pic:spPr bwMode="auto">
+                          <a:xfrm>
+                            <a:off x="0" y="0"/>
+                            <a:ext cx="6400800" cy="3466465"/>
+                          </a:xfrm>
+                          <a:prstGeom prst="rect">
+                            <a:avLst/>
+                          </a:prstGeom>
+                          <a:noFill/>
+                          <a:ln>
+                            <a:noFill/>
+                          </a:ln>
+                        </pic:spPr>
+                      </pic:pic>
+                    </a:graphicData>
+                  </a:graphic>
+                </wp:inline>
+              </w:drawing>
+            </w:r>
+          </w:p>
+        </w:tc>
+      </w:tr>
+      <w:tr>
+        <w:tc>
+          <w:tcPr>
+            <w:tcW w:w="3200" w:type="dxa"/>
+            <w:tcBorders>
+              <w:top w:val="single" w:sz="1" w:space="0" w:color="AAAAAA"/>
+              <w:left w:val="single" w:sz="1" w:space="0" w:color="AAAAAA"/>
+              <w:bottom w:val="single" w:sz="1" w:space="0" w:color="AAAAAA"/>
+              <w:right w:val="single" w:sz="1" w:space="0" w:color="AAAAAA"/>
+            </w:tcBorders>
+            <w:shd w:val="clear" w:color="auto" w:fill="EBF3FA"/>
+            <w:tcMar>
+              <w:top w:w="80" w:type="dxa"/>
+              <w:left w:w="120" w:type="dxa"/>
+              <w:bottom w:w="80" w:type="dxa"/>
+              <w:right w:w="120" w:type="dxa"/>
+            </w:tcMar>
+            <w:vAlign w:val="center"/>
+          </w:tcPr>
+          <w:p>
+            <w:r>
+              <w:rPr>
+                <w:b/>
+                <w:bCs/>
+                <w:color w:val="000000"/>
+                <w:sz w:val="20"/>
+                <w:szCs w:val="20"/>
+              </w:rPr>
+              <w:lastRenderedPageBreak/>
+              <w:t>Live PakVista – Production Render Service (all 5 pages accessible)</w:t>
+            </w:r>
+          </w:p>
+        </w:tc>
+        <w:tc>
+          <w:tcPr>
+            <w:tcW w:w="6160" w:type="dxa"/>
+            <w:tcBorders>
+              <w:top w:val="single" w:sz="1" w:space="0" w:color="AAAAAA"/>
+              <w:left w:val="single" w:sz="1" w:space="0" w:color="AAAAAA"/>
+              <w:bottom w:val="single" w:sz="1" w:space="0" w:color="AAAAAA"/>
+              <w:right w:val="single" w:sz="1" w:space="0" w:color="AAAAAA"/>
+            </w:tcBorders>
+            <w:shd w:val="clear" w:color="auto" w:fill="EBF3FA"/>
+            <w:tcMar>
+              <w:top w:w="80" w:type="dxa"/>
+              <w:left w:w="120" w:type="dxa"/>
+              <w:bottom w:w="80" w:type="dxa"/>
+              <w:right w:w="120" w:type="dxa"/>
+            </w:tcMar>
+          </w:tcPr>
+          <w:p>
+            <w:r>
+              <w:rPr>
+                <w:i/>
+                <w:iCs/>
+                <w:color w:val="595959"/>
+                <w:sz w:val="20"/>
+                <w:szCs w:val="20"/>
+              </w:rPr>
+              <w:t>[Paste screenshot h</w:t>
+            </w:r>
+            <w:r>
+              <w:rPr>
+                <w:i/>
+                <w:iCs/>
+                <w:color w:val="595959"/>
+                <w:sz w:val="20"/>
+                <w:szCs w:val="20"/>
+              </w:rPr>
+              <w:drawing>
+                <wp:inline distT="0" distB="0" distL="0" distR="0" wp14:anchorId="409113CA" wp14:editId="18B10F84">
+                  <wp:extent cx="6400800" cy="3467100"/>
+                  <wp:effectExtent l="0" t="0" r="0" b="0"/>
+                  <wp:docPr id="1027408707" name="Picture 1"/>
+                  <wp:cNvGraphicFramePr>
+                    <a:graphicFrameLocks xmlns:a="http://schemas.openxmlformats.org/drawingml/2006/main" noChangeAspect="1"/>
+                  </wp:cNvGraphicFramePr>
+                  <a:graphic xmlns:a="http://schemas.openxmlformats.org/drawingml/2006/main">
+                    <a:graphicData uri="http://schemas.openxmlformats.org/drawingml/2006/picture">
+                      <pic:pic xmlns:pic="http://schemas.openxmlformats.org/drawingml/2006/picture">
+                        <pic:nvPicPr>
+                          <pic:cNvPr id="1027408707" name=""/>
+                          <pic:cNvPicPr/>
+                        </pic:nvPicPr>
+                        <pic:blipFill>
+                          <a:blip r:embed="rId13"/>
+                          <a:stretch>
+                            <a:fillRect/>
+                          </a:stretch>
+                        </pic:blipFill>
+                        <pic:spPr>
+                          <a:xfrm>
+                            <a:off x="0" y="0"/>
+                            <a:ext cx="6400800" cy="3467100"/>
+                          </a:xfrm>
+                          <a:prstGeom prst="rect">
+                            <a:avLst/>
+                          </a:prstGeom>
+                        </pic:spPr>
+                      </pic:pic>
+                    </a:graphicData>
+                  </a:graphic>
+                </wp:inline>
+              </w:drawing>
+            </w:r>
+            <w:r>
+              <w:rPr>
+                <w:i/>
+                <w:iCs/>
+                <w:color w:val="595959"/>
+                <w:sz w:val="20"/>
+                <w:szCs w:val="20"/>
+              </w:rPr>
+              <w:t>ere]</w:t>
+            </w:r>
+          </w:p>
+        </w:tc>
+      </w:tr>
+      <w:tr>
+        <w:tc>
+          <w:tcPr>
+            <w:tcW w:w="3200" w:type="dxa"/>
+            <w:tcBorders>
+              <w:top w:val="single" w:sz="1" w:space="0" w:color="AAAAAA"/>
+              <w:left w:val="single" w:sz="1" w:space="0" w:color="AAAAAA"/>
+              <w:bottom w:val="single" w:sz="1" w:space="0" w:color="AAAAAA"/>
+              <w:right w:val="single" w:sz="1" w:space="0" w:color="AAAAAA"/>
+            </w:tcBorders>
+            <w:shd w:val="clear" w:color="auto" w:fill="FFFFFF"/>
+            <w:tcMar>
+              <w:top w:w="80" w:type="dxa"/>
+              <w:left w:w="120" w:type="dxa"/>
+              <w:bottom w:w="80" w:type="dxa"/>
+              <w:right w:w="120" w:type="dxa"/>
+            </w:tcMar>
+            <w:vAlign w:val="center"/>
+          </w:tcPr>
+          <w:p>
+            <w:r>
+              <w:rPr>
+                <w:b/>
+                <w:bCs/>
+                <w:color w:val="000000"/>
+                <w:sz w:val="20"/>
+                <w:szCs w:val="20"/>
+              </w:rPr>
+              <w:t>Term Project .docx visible in GitHub Repository file listing</w:t>
+            </w:r>
+          </w:p>
+        </w:tc>
+        <w:tc>
+          <w:tcPr>
+            <w:tcW w:w="6160" w:type="dxa"/>
+            <w:tcBorders>
+              <w:top w:val="single" w:sz="1" w:space="0" w:color="AAAAAA"/>
+              <w:left w:val="single" w:sz="1" w:space="0" w:color="AAAAAA"/>
+              <w:bottom w:val="single" w:sz="1" w:space="0" w:color="AAAAAA"/>
+              <w:right w:val="single" w:sz="1" w:space="0" w:color="AAAAAA"/>
+            </w:tcBorders>
+            <w:shd w:val="clear" w:color="auto" w:fill="FFFFFF"/>
+            <w:tcMar>
+              <w:top w:w="80" w:type="dxa"/>
+              <w:left w:w="120" w:type="dxa"/>
+              <w:bottom w:w="80" w:type="dxa"/>
+              <w:right w:w="120" w:type="dxa"/>
+            </w:tcMar>
+          </w:tcPr>
+          <w:p>
+            <w:r>
+              <w:rPr>
+                <w:i/>
+                <w:iCs/>
+                <w:color w:val="595959"/>
+                <w:sz w:val="20"/>
+                <w:szCs w:val="20"/>
+              </w:rPr>
+              <w:t>[Paste screenshot here</w:t>
+            </w:r>
+            <w:r>
+              <w:rPr>
+                <w:i/>
+                <w:iCs/>
+                <w:color w:val="595959"/>
+                <w:sz w:val="20"/>
+                <w:szCs w:val="20"/>
+              </w:rPr>
+              <w:drawing>
+                <wp:inline distT="0" distB="0" distL="0" distR="0" wp14:anchorId="4BC94BC1" wp14:editId="046C0EEC">
+                  <wp:extent cx="6400800" cy="3467100"/>
+                  <wp:effectExtent l="0" t="0" r="0" b="0"/>
+                  <wp:docPr id="1030029325" name="Picture 1"/>
+                  <wp:cNvGraphicFramePr>
+                    <a:graphicFrameLocks xmlns:a="http://schemas.openxmlformats.org/drawingml/2006/main" noChangeAspect="1"/>
+                  </wp:cNvGraphicFramePr>
+                  <a:graphic xmlns:a="http://schemas.openxmlformats.org/drawingml/2006/main">
+                    <a:graphicData uri="http://schemas.openxmlformats.org/drawingml/2006/picture">
+                      <pic:pic xmlns:pic="http://schemas.openxmlformats.org/drawingml/2006/picture">
+                        <pic:nvPicPr>
+                          <pic:cNvPr id="1030029325" name=""/>
+                          <pic:cNvPicPr/>
+                        </pic:nvPicPr>
+                        <pic:blipFill>
+                          <a:blip r:embed="rId14"/>
+                          <a:stretch>
+                            <a:fillRect/>
+                          </a:stretch>
+                        </pic:blipFill>
+                        <pic:spPr>
+                          <a:xfrm>
+                            <a:off x="0" y="0"/>
+                            <a:ext cx="6400800" cy="3467100"/>
+                          </a:xfrm>
+                          <a:prstGeom prst="rect">
+                            <a:avLst/>
+                          </a:prstGeom>
+                        </pic:spPr>
+                      </pic:pic>
+                    </a:graphicData>
+                  </a:graphic>
+                </wp:inline>
+              </w:drawing>
+            </w:r>
+            <w:r>
+              <w:rPr>
+                <w:i/>
+                <w:iCs/>
+                <w:color w:val="595959"/>
+                <w:sz w:val="20"/>
+                <w:szCs w:val="20"/>
+              </w:rPr>
+              <w:t>]</w:t>
             </w:r>
           </w:p>
         </w:tc>
       </w:tr>
     </w:tbl>
     <w:p/>
+    <w:p/>
+    <w:p/>
+    <w:p/>
     <w:p>
       <w:pPr>
         <w:pStyle w:val="Heading1"/>
       </w:pPr>
       <w:r>
+        <w:lastRenderedPageBreak/>
         <w:t>INDIVIDUAL REFLECTIONS</w:t>
       </w:r>
     </w:p>
@@ -13419,23 +14054,40 @@
           <w:bCs/>
           <w:color w:val="2E75B6"/>
         </w:rPr>
-        <w:t>Member 1: [Student Name] – Reflection</w:t>
-      </w:r>
-    </w:p>
-    <w:p>
-      <w:pPr>
-        <w:pBdr>
-          <w:bottom w:val="single" w:sz="2" w:space="1" w:color="CCCCCC"/>
-        </w:pBdr>
-        <w:spacing w:before="160" w:after="40"/>
-      </w:pPr>
-      <w:r>
+        <w:t xml:space="preserve">Member 1: </w:t>
+      </w:r>
+      <w:r>
+        <w:rPr>
+          <w:b/>
+          <w:bCs/>
+          <w:color w:val="2E75B6"/>
+        </w:rPr>
+        <w:t>Haroon Ashar</w:t>
+      </w:r>
+      <w:r>
+        <w:rPr>
+          <w:b/>
+          <w:bCs/>
+          <w:color w:val="2E75B6"/>
+        </w:rPr>
+        <w:t xml:space="preserve"> – Reflection</w:t>
+      </w:r>
+    </w:p>
+    <w:p>
+      <w:pPr>
         <w:rPr>
           <w:i/>
           <w:iCs/>
           <w:color w:val="595959"/>
         </w:rPr>
-        <w:t>[Write your 4–5 line reflection here]</w:t>
+      </w:pPr>
+      <w:r>
+        <w:rPr>
+          <w:i/>
+          <w:iCs/>
+          <w:color w:val="595959"/>
+        </w:rPr>
+        <w:t>As team lead, I set up the repository, branch protection rules, and CI/CD pipeline, and coordinated four team members through their PRs and approvals. Debugging recurring pipeline failures and promoting the project through develop → staging → main taught me the importance of clear communication and staying calm under technical pressure.</w:t>
       </w:r>
     </w:p>
     <w:p/>
@@ -13449,26 +14101,35 @@
           <w:bCs/>
           <w:color w:val="2E75B6"/>
         </w:rPr>
-        <w:t>Member 2: [Student Name] – Reflection</w:t>
-      </w:r>
-    </w:p>
-    <w:p>
-      <w:pPr>
-        <w:pBdr>
-          <w:bottom w:val="single" w:sz="2" w:space="1" w:color="CCCCCC"/>
-        </w:pBdr>
-        <w:spacing w:before="160" w:after="40"/>
-      </w:pPr>
+        <w:t xml:space="preserve">Member 2: </w:t>
+      </w:r>
+      <w:r>
+        <w:rPr>
+          <w:b/>
+          <w:bCs/>
+          <w:color w:val="2E75B6"/>
+        </w:rPr>
+        <w:t xml:space="preserve">Muhammad Ahmad </w:t>
+      </w:r>
+      <w:r>
+        <w:rPr>
+          <w:b/>
+          <w:bCs/>
+          <w:color w:val="2E75B6"/>
+        </w:rPr>
+        <w:t>– Reflection</w:t>
+      </w:r>
+    </w:p>
+    <w:p>
       <w:r>
         <w:rPr>
           <w:i/>
           <w:iCs/>
           <w:color w:val="595959"/>
         </w:rPr>
-        <w:t>[Write your 4–5 line reflection here]</w:t>
-      </w:r>
-    </w:p>
-    <w:p/>
+        <w:t>I developed the Hunza destination page and worked with GitFlow and pull requests throughout the project. I resolved Stylelint issues and ensured my code passed the CI/CD pipeline checks. This project enhanced my understanding of version control, code quality standards, and collaborative DevOps workflows.</w:t>
+      </w:r>
+    </w:p>
     <w:p>
       <w:pPr>
         <w:spacing w:before="100" w:after="40"/>
@@ -13479,26 +14140,35 @@
           <w:bCs/>
           <w:color w:val="2E75B6"/>
         </w:rPr>
-        <w:t>Member 3: [Student Name] – Reflection</w:t>
-      </w:r>
-    </w:p>
-    <w:p>
-      <w:pPr>
-        <w:pBdr>
-          <w:bottom w:val="single" w:sz="2" w:space="1" w:color="CCCCCC"/>
-        </w:pBdr>
-        <w:spacing w:before="160" w:after="40"/>
-      </w:pPr>
+        <w:t xml:space="preserve">Member 3: </w:t>
+      </w:r>
+      <w:r>
+        <w:rPr>
+          <w:b/>
+          <w:bCs/>
+          <w:color w:val="2E75B6"/>
+        </w:rPr>
+        <w:t>Asfand yar Haider</w:t>
+      </w:r>
+      <w:r>
+        <w:rPr>
+          <w:b/>
+          <w:bCs/>
+          <w:color w:val="2E75B6"/>
+        </w:rPr>
+        <w:t xml:space="preserve"> – Reflection</w:t>
+      </w:r>
+    </w:p>
+    <w:p>
       <w:r>
         <w:rPr>
           <w:i/>
           <w:iCs/>
           <w:color w:val="595959"/>
         </w:rPr>
-        <w:t>[Write your 4–5 line reflection here]</w:t>
-      </w:r>
-    </w:p>
-    <w:p/>
+        <w:t>I coded the Karachi page, The project has made me realize that git branch rules must no longer exist past 2026. Therefore I'll make a repo hosting platform which people might see as a meme at first, but they'll have to set up ci/cd for every single line to protect their own code with rules cuz anyone can push and merge.</w:t>
+      </w:r>
+    </w:p>
     <w:p>
       <w:pPr>
         <w:spacing w:before="100" w:after="40"/>
@@ -13509,26 +14179,35 @@
           <w:bCs/>
           <w:color w:val="2E75B6"/>
         </w:rPr>
-        <w:t>Member 4: [Student Name] – Reflection</w:t>
-      </w:r>
-    </w:p>
-    <w:p>
-      <w:pPr>
-        <w:pBdr>
-          <w:bottom w:val="single" w:sz="2" w:space="1" w:color="CCCCCC"/>
-        </w:pBdr>
-        <w:spacing w:before="160" w:after="40"/>
-      </w:pPr>
+        <w:t xml:space="preserve">Member 4: </w:t>
+      </w:r>
+      <w:r>
+        <w:rPr>
+          <w:b/>
+          <w:bCs/>
+          <w:color w:val="2E75B6"/>
+        </w:rPr>
+        <w:t xml:space="preserve">Abdul Mateen </w:t>
+      </w:r>
+      <w:r>
+        <w:rPr>
+          <w:b/>
+          <w:bCs/>
+          <w:color w:val="2E75B6"/>
+        </w:rPr>
+        <w:t>– Reflection</w:t>
+      </w:r>
+    </w:p>
+    <w:p>
       <w:r>
         <w:rPr>
           <w:i/>
           <w:iCs/>
           <w:color w:val="595959"/>
         </w:rPr>
-        <w:t>[Write your 4–5 line reflection here]</w:t>
-      </w:r>
-    </w:p>
-    <w:p/>
+        <w:t>As Member 4, I contributed the Swat Valley destination page and experienced firsthand how feature branches, pull requests, CI checks, and peer code reviews work together to maintain code quality in a collaborative DevOps workflow.</w:t>
+      </w:r>
+    </w:p>
     <w:p>
       <w:pPr>
         <w:spacing w:before="100" w:after="40"/>
@@ -13539,23 +14218,73 @@
           <w:bCs/>
           <w:color w:val="2E75B6"/>
         </w:rPr>
-        <w:t>Member 5: [Student Name] – Reflection</w:t>
-      </w:r>
-    </w:p>
-    <w:p>
-      <w:pPr>
-        <w:pBdr>
-          <w:bottom w:val="single" w:sz="2" w:space="1" w:color="CCCCCC"/>
-        </w:pBdr>
-        <w:spacing w:before="160" w:after="40"/>
-      </w:pPr>
+        <w:t>Member 5:</w:t>
+      </w:r>
+      <w:r>
+        <w:rPr>
+          <w:b/>
+          <w:bCs/>
+          <w:color w:val="2E75B6"/>
+        </w:rPr>
+        <w:t xml:space="preserve"> Hasham </w:t>
+      </w:r>
+      <w:r>
+        <w:rPr>
+          <w:b/>
+          <w:bCs/>
+          <w:color w:val="2E75B6"/>
+        </w:rPr>
+        <w:t>– Reflection</w:t>
+      </w:r>
+    </w:p>
+    <w:p>
       <w:r>
         <w:rPr>
           <w:i/>
           <w:iCs/>
           <w:color w:val="595959"/>
         </w:rPr>
-        <w:t>[Write your 4–5 line reflection here]</w:t>
+        <w:t xml:space="preserve">I coded the </w:t>
+      </w:r>
+      <w:r>
+        <w:rPr>
+          <w:i/>
+          <w:iCs/>
+          <w:color w:val="595959"/>
+        </w:rPr>
+        <w:t>Lahore</w:t>
+      </w:r>
+      <w:r>
+        <w:rPr>
+          <w:i/>
+          <w:iCs/>
+          <w:color w:val="595959"/>
+        </w:rPr>
+        <w:t xml:space="preserve"> page, The project has made me realize that git branch rules must no longer exist past 2026</w:t>
+      </w:r>
+      <w:r>
+        <w:rPr>
+          <w:i/>
+          <w:iCs/>
+          <w:color w:val="595959"/>
+        </w:rPr>
+        <w:t>.</w:t>
+      </w:r>
+      <w:r>
+        <w:rPr>
+          <w:i/>
+          <w:iCs/>
+          <w:color w:val="595959"/>
+        </w:rPr>
+        <w:t xml:space="preserve"> </w:t>
+      </w:r>
+      <w:r>
+        <w:rPr>
+          <w:i/>
+          <w:iCs/>
+          <w:color w:val="595959"/>
+        </w:rPr>
+        <w:t>This project enhanced my understanding of version control, code quality standards, and collaborative DevOps workflows.</w:t>
       </w:r>
     </w:p>
     <w:p/>
@@ -14858,8 +15587,8 @@
     </w:tbl>
     <w:p/>
     <w:sectPr>
-      <w:headerReference w:type="default" r:id="rId7"/>
-      <w:footerReference w:type="default" r:id="rId8"/>
+      <w:headerReference w:type="default" r:id="rId15"/>
+      <w:footerReference w:type="default" r:id="rId16"/>
       <w:pgSz w:w="12240" w:h="15840"/>
       <w:pgMar w:top="1080" w:right="1080" w:bottom="1080" w:left="1080" w:header="708" w:footer="708" w:gutter="0"/>
       <w:cols w:space="720"/>
@@ -15925,7 +16654,7 @@
   <w:style w:type="paragraph" w:default="1" w:styleId="Normal">
     <w:name w:val="Normal"/>
     <w:qFormat/>
-    <w:rsid w:val="0052654E"/>
+    <w:rsid w:val="00B70A60"/>
   </w:style>
   <w:style w:type="paragraph" w:styleId="Heading1">
     <w:name w:val="heading 1"/>
@@ -16022,7 +16751,6 @@
   <w:style w:type="character" w:default="1" w:styleId="DefaultParagraphFont">
     <w:name w:val="Default Paragraph Font"/>
     <w:uiPriority w:val="1"/>
-    <w:semiHidden/>
     <w:unhideWhenUsed/>
   </w:style>
   <w:style w:type="table" w:default="1" w:styleId="TableNormal">

</xml_diff>